<commit_message>
Added CV2 and LV2
</commit_message>
<xml_diff>
--- a/CV2.docx
+++ b/CV2.docx
@@ -8924,39 +8924,7 @@
           <w:u w:val="none"/>
         </w:rPr>
         <w:tab/>
-        <w:t xml:space="preserve">The assembler is much like the compiler, </w:t>
-      </w:r>
-      <w:r>
-        <w:rPr>
-          <w:i w:val="false"/>
-          <w:iCs w:val="false"/>
-          <w:u w:val="none"/>
-        </w:rPr>
-        <w:t>only</w:t>
-      </w:r>
-      <w:r>
-        <w:rPr>
-          <w:i w:val="false"/>
-          <w:iCs w:val="false"/>
-          <w:u w:val="none"/>
-        </w:rPr>
-        <w:t xml:space="preserve"> for assembly language. If you’ve ever worked with assembly, you would know that it needs to get assembled via an assembler, which breaks down the assembly flavour into machine-readable code called “machine code”. Effectively, machine code is just binary. </w:t>
-      </w:r>
-      <w:r>
-        <w:rPr>
-          <w:i w:val="false"/>
-          <w:iCs w:val="false"/>
-          <w:u w:val="none"/>
-        </w:rPr>
-        <w:t xml:space="preserve">Technically, the assembler will actually convert the assembly code into </w:t>
-      </w:r>
-      <w:r>
-        <w:rPr>
-          <w:i w:val="false"/>
-          <w:iCs w:val="false"/>
-          <w:u w:val="none"/>
-        </w:rPr>
-        <w:t>object code (.o files), which is the same as machine code, but contains extra metadata in its header.</w:t>
+        <w:t>The assembler is much like the compiler, only for assembly language. If you’ve ever worked with assembly, you would know that it needs to get assembled via an assembler, which breaks down the assembly flavour into machine-readable code called “machine code”. Effectively, machine code is just binary. Technically, the assembler will actually convert the assembly code into object code (.o files), which is the same as machine code, but contains extra metadata in its header.</w:t>
       </w:r>
     </w:p>
     <w:p>
@@ -9014,103 +8982,7 @@
           <w:u w:val="none"/>
         </w:rPr>
         <w:tab/>
-        <w:t xml:space="preserve">The linker is an important step in the compilation pipeline. There are two things that the linker does: static linking and dynamic linking. Static linking is concerned with the object files generated by the assembler. It will look for the definition of certain functions and variables and match them to their corresponding address space. For example, if a function was defined within </w:t>
-      </w:r>
-      <w:r>
-        <w:rPr>
-          <w:i w:val="false"/>
-          <w:iCs w:val="false"/>
-          <w:u w:val="none"/>
-        </w:rPr>
-        <w:t>a</w:t>
-      </w:r>
-      <w:r>
-        <w:rPr>
-          <w:i w:val="false"/>
-          <w:iCs w:val="false"/>
-          <w:u w:val="none"/>
-        </w:rPr>
-        <w:t xml:space="preserve">.o, but is called in </w:t>
-      </w:r>
-      <w:r>
-        <w:rPr>
-          <w:i w:val="false"/>
-          <w:iCs w:val="false"/>
-          <w:u w:val="none"/>
-        </w:rPr>
-        <w:t>b</w:t>
-      </w:r>
-      <w:r>
-        <w:rPr>
-          <w:i w:val="false"/>
-          <w:iCs w:val="false"/>
-          <w:u w:val="none"/>
-        </w:rPr>
-        <w:t xml:space="preserve">.o, the linker must tell </w:t>
-      </w:r>
-      <w:r>
-        <w:rPr>
-          <w:i w:val="false"/>
-          <w:iCs w:val="false"/>
-          <w:u w:val="none"/>
-        </w:rPr>
-        <w:t>b</w:t>
-      </w:r>
-      <w:r>
-        <w:rPr>
-          <w:i w:val="false"/>
-          <w:iCs w:val="false"/>
-          <w:u w:val="none"/>
-        </w:rPr>
-        <w:t xml:space="preserve">.o that the function is defined in </w:t>
-      </w:r>
-      <w:r>
-        <w:rPr>
-          <w:i w:val="false"/>
-          <w:iCs w:val="false"/>
-          <w:u w:val="none"/>
-        </w:rPr>
-        <w:t>a</w:t>
-      </w:r>
-      <w:r>
-        <w:rPr>
-          <w:i w:val="false"/>
-          <w:iCs w:val="false"/>
-          <w:u w:val="none"/>
-        </w:rPr>
-        <w:t xml:space="preserve">.o. In other words, static linking resolves symbols and relocates code amongst the object files that were output by the assembler. I mentioned earlier that Linux has shared object files (.so). Shared object files are typically libraries (a collection of .o files) that are loaded into main memory for any program to access. For instance, almost all programs link the libc library. In GNU/Linux, libc is technically known as glibc, since GNU rewrote libc from Unix </w:t>
-      </w:r>
-      <w:r>
-        <w:rPr>
-          <w:i w:val="false"/>
-          <w:iCs w:val="false"/>
-          <w:u w:val="none"/>
-        </w:rPr>
-        <w:t>(On Windows, libc might be called libcmt.lib. The C standard library can have multiple implementations depending on the platform)</w:t>
-      </w:r>
-      <w:r>
-        <w:rPr>
-          <w:i w:val="false"/>
-          <w:iCs w:val="false"/>
-          <w:u w:val="none"/>
-        </w:rPr>
-        <w:t>. Anyways, having libc be a shared object means that we can reduce executable sizes since we don’t need to physically add the contents of libc to our program. On top of that, if libc were to ever need a rewrite/update, it could do this without affecting your program. In my case, libc is located under /</w:t>
-      </w:r>
-      <w:r>
-        <w:rPr>
-          <w:i w:val="false"/>
-          <w:iCs w:val="false"/>
-          <w:u w:val="none"/>
-        </w:rPr>
-        <w:t>usr/lib/libc.so.6</w:t>
-      </w:r>
-      <w:r>
-        <w:rPr>
-          <w:i w:val="false"/>
-          <w:iCs w:val="false"/>
-          <w:u w:val="none"/>
-        </w:rPr>
-        <w:t>. If we run the file command on it (which outputs information about the type of file), we see that it is an ELF 64-bit shared object file and that it is dynamically linked. To summarize, the linker does both static, and dynamic linking, and is responsible for linking any included libraries as well. The linker will output an executable for us to be able to run.</w:t>
+        <w:t>The linker is an important step in the compilation pipeline. There are two things that the linker does: static linking and dynamic linking. Static linking is concerned with the object files generated by the assembler. It will look for the definition of certain functions and variables and match them to their corresponding address space. For example, if a function was defined within a.o, but is called in b.o, the linker must tell b.o that the function is defined in a.o. In other words, static linking resolves symbols and relocates code amongst the object files that were output by the assembler. I mentioned earlier that Linux has shared object files (.so). Shared object files are typically libraries (a collection of .o files) that are loaded into main memory for any program to access. For instance, almost all programs link the libc library. In GNU/Linux, libc is technically known as glibc, since GNU rewrote libc from Unix (On Windows, libc might be called libcmt.lib. The C standard library can have multiple implementations depending on the platform). Anyways, having libc be a shared object means that we can reduce executable sizes since we don’t need to physically add the contents of libc to our program. On top of that, if libc were to ever need a rewrite/update, it could do this without affecting your program. In my case, libc is located under /usr/lib/libc.so.6. If we run the file command on it (which outputs information about the type of file), we see that it is an ELF 64-bit shared object file and that it is dynamically linked. To summarize, the linker does both static, and dynamic linking, and is responsible for linking any included libraries as well. The linker will output an executable for us to be able to run.</w:t>
       </w:r>
     </w:p>
     <w:p>
@@ -9163,337 +9035,7 @@
           <w:u w:val="none"/>
         </w:rPr>
         <w:tab/>
-        <w:t xml:space="preserve">It may be debated as to whether the loader is part of the compilation phase. </w:t>
-      </w:r>
-      <w:r>
-        <w:rPr>
-          <w:u w:val="none"/>
-        </w:rPr>
-        <w:t>Whether or not it is,</w:t>
-      </w:r>
-      <w:r>
-        <w:rPr>
-          <w:u w:val="none"/>
-        </w:rPr>
-        <w:t xml:space="preserve"> I </w:t>
-      </w:r>
-      <w:r>
-        <w:rPr>
-          <w:u w:val="none"/>
-        </w:rPr>
-        <w:t>think it’s important that we learn about it, so I’m including it here</w:t>
-      </w:r>
-      <w:r>
-        <w:rPr>
-          <w:u w:val="none"/>
-        </w:rPr>
-        <w:t xml:space="preserve">. The loader is </w:t>
-      </w:r>
-      <w:r>
-        <w:rPr>
-          <w:u w:val="none"/>
-        </w:rPr>
-        <w:t>s</w:t>
-      </w:r>
-      <w:r>
-        <w:rPr>
-          <w:u w:val="none"/>
-        </w:rPr>
-        <w:t xml:space="preserve">imply responsible </w:t>
-      </w:r>
-      <w:r>
-        <w:rPr>
-          <w:u w:val="none"/>
-        </w:rPr>
-        <w:t xml:space="preserve">for </w:t>
-      </w:r>
-      <w:r>
-        <w:rPr>
-          <w:u w:val="none"/>
-        </w:rPr>
-        <w:t>load</w:t>
-      </w:r>
-      <w:r>
-        <w:rPr>
-          <w:u w:val="none"/>
-        </w:rPr>
-        <w:t>ing</w:t>
-      </w:r>
-      <w:r>
-        <w:rPr>
-          <w:u w:val="none"/>
-        </w:rPr>
-        <w:t xml:space="preserve"> our executable code into memory. When you run ./exe the loader must create a new running process. </w:t>
-      </w:r>
-      <w:r>
-        <w:rPr>
-          <w:u w:val="none"/>
-        </w:rPr>
-        <w:t>Your</w:t>
-      </w:r>
-      <w:r>
-        <w:rPr>
-          <w:u w:val="none"/>
-        </w:rPr>
-        <w:t xml:space="preserve"> process </w:t>
-      </w:r>
-      <w:r>
-        <w:rPr>
-          <w:u w:val="none"/>
-        </w:rPr>
-        <w:t>reserves</w:t>
-      </w:r>
-      <w:r>
-        <w:rPr>
-          <w:u w:val="none"/>
-        </w:rPr>
-        <w:t xml:space="preserve"> a </w:t>
-      </w:r>
-      <w:r>
-        <w:rPr>
-          <w:u w:val="none"/>
-        </w:rPr>
-        <w:t>location</w:t>
-      </w:r>
-      <w:r>
-        <w:rPr>
-          <w:u w:val="none"/>
-        </w:rPr>
-        <w:t xml:space="preserve"> in memory where </w:t>
-      </w:r>
-      <w:r>
-        <w:rPr>
-          <w:u w:val="none"/>
-        </w:rPr>
-        <w:t>the program stack</w:t>
-      </w:r>
-      <w:r>
-        <w:rPr>
-          <w:u w:val="none"/>
-        </w:rPr>
-        <w:t xml:space="preserve"> </w:t>
-      </w:r>
-      <w:r>
-        <w:rPr>
-          <w:u w:val="none"/>
-        </w:rPr>
-        <w:t>(</w:t>
-      </w:r>
-      <w:r>
-        <w:rPr>
-          <w:u w:val="none"/>
-        </w:rPr>
-        <w:t>a</w:t>
-      </w:r>
-      <w:r>
-        <w:rPr>
-          <w:u w:val="none"/>
-        </w:rPr>
-        <w:t>s well as for certain</w:t>
-      </w:r>
-      <w:r>
-        <w:rPr>
-          <w:u w:val="none"/>
-        </w:rPr>
-        <w:t xml:space="preserve"> system resources </w:t>
-      </w:r>
-      <w:r>
-        <w:rPr>
-          <w:u w:val="none"/>
-        </w:rPr>
-        <w:t xml:space="preserve">that must be accessible to the process) </w:t>
-      </w:r>
-      <w:r>
-        <w:rPr>
-          <w:u w:val="none"/>
-        </w:rPr>
-        <w:t xml:space="preserve">will reside. It will then create a jump instruction to your program so that it can begin execution. Processes are a very complex topic which I plan to cover in the future (likely in </w:t>
-      </w:r>
-      <w:r>
-        <w:rPr>
-          <w:u w:val="none"/>
-        </w:rPr>
-        <w:t xml:space="preserve">the </w:t>
-      </w:r>
-      <w:r>
-        <w:rPr>
-          <w:u w:val="none"/>
-        </w:rPr>
-        <w:t xml:space="preserve">Linux document) so look out for that. Now that we have an executable, we can run the program. </w:t>
-      </w:r>
-      <w:r>
-        <w:rPr>
-          <w:u w:val="none"/>
-        </w:rPr>
-        <w:t>Here are s</w:t>
-      </w:r>
-      <w:r>
-        <w:rPr>
-          <w:u w:val="none"/>
-        </w:rPr>
-        <w:t xml:space="preserve">ome interesting commands to try on the command line: strings, file, readelf, </w:t>
-      </w:r>
-      <w:r>
-        <w:rPr>
-          <w:u w:val="none"/>
-        </w:rPr>
-        <w:t>ldd, ltrace, strace</w:t>
-      </w:r>
-      <w:r>
-        <w:rPr>
-          <w:u w:val="none"/>
-        </w:rPr>
-        <w:t xml:space="preserve">. The strings command will print out all ASCII strings within the executable file. Most of the file is binary garbage that we can’t read, but strings will find metadata which </w:t>
-      </w:r>
-      <w:r>
-        <w:rPr>
-          <w:u w:val="none"/>
-        </w:rPr>
-        <w:t>may be useful</w:t>
-      </w:r>
-      <w:r>
-        <w:rPr>
-          <w:u w:val="none"/>
-        </w:rPr>
-        <w:t xml:space="preserve">. Note that the only purpose of strings is to show you the strings </w:t>
-      </w:r>
-      <w:r>
-        <w:rPr>
-          <w:u w:val="none"/>
-        </w:rPr>
-        <w:t>that exist</w:t>
-      </w:r>
-      <w:r>
-        <w:rPr>
-          <w:u w:val="none"/>
-        </w:rPr>
-        <w:t xml:space="preserve"> </w:t>
-      </w:r>
-      <w:r>
-        <w:rPr>
-          <w:u w:val="none"/>
-        </w:rPr>
-        <w:t>with</w:t>
-      </w:r>
-      <w:r>
-        <w:rPr>
-          <w:u w:val="none"/>
-        </w:rPr>
-        <w:t xml:space="preserve">in the file, </w:t>
-      </w:r>
-      <w:r>
-        <w:rPr>
-          <w:u w:val="none"/>
-        </w:rPr>
-        <w:t>nothing more</w:t>
-      </w:r>
-      <w:r>
-        <w:rPr>
-          <w:u w:val="none"/>
-        </w:rPr>
-        <w:t xml:space="preserve">. </w:t>
-      </w:r>
-      <w:r>
-        <w:rPr>
-          <w:u w:val="none"/>
-        </w:rPr>
-        <w:t>The f</w:t>
-      </w:r>
-      <w:r>
-        <w:rPr>
-          <w:u w:val="none"/>
-        </w:rPr>
-        <w:t xml:space="preserve">ile </w:t>
-      </w:r>
-      <w:r>
-        <w:rPr>
-          <w:u w:val="none"/>
-        </w:rPr>
-        <w:t>command</w:t>
-      </w:r>
-      <w:r>
-        <w:rPr>
-          <w:u w:val="none"/>
-        </w:rPr>
-        <w:t>, as we seen, tells you more information about the file you give it</w:t>
-      </w:r>
-      <w:r>
-        <w:rPr>
-          <w:u w:val="none"/>
-        </w:rPr>
-        <w:t xml:space="preserve"> Primarily it just tells you the type of file, but it may give you a varying degree of information depending on the file type</w:t>
-      </w:r>
-      <w:r>
-        <w:rPr>
-          <w:u w:val="none"/>
-        </w:rPr>
-        <w:t xml:space="preserve">. </w:t>
-      </w:r>
-      <w:r>
-        <w:rPr>
-          <w:u w:val="none"/>
-        </w:rPr>
-        <w:t xml:space="preserve">The </w:t>
-      </w:r>
-      <w:r>
-        <w:rPr>
-          <w:u w:val="none"/>
-        </w:rPr>
-        <w:t xml:space="preserve">readelf </w:t>
-      </w:r>
-      <w:r>
-        <w:rPr>
-          <w:u w:val="none"/>
-        </w:rPr>
-        <w:t>utility has</w:t>
-      </w:r>
-      <w:r>
-        <w:rPr>
-          <w:u w:val="none"/>
-        </w:rPr>
-        <w:t xml:space="preserve"> a few different command line options </w:t>
-      </w:r>
-      <w:r>
-        <w:rPr>
-          <w:u w:val="none"/>
-        </w:rPr>
-        <w:t>which you can check out in the man pages</w:t>
-      </w:r>
-      <w:r>
-        <w:rPr>
-          <w:u w:val="none"/>
-        </w:rPr>
-        <w:t xml:space="preserve">. </w:t>
-      </w:r>
-      <w:r>
-        <w:rPr>
-          <w:u w:val="none"/>
-        </w:rPr>
-        <w:t>The -a option outputs all metadata. This utility is similar to objdump, but is specifically for ELF executables. It is most useful for showing us the debug symbols ie. the function and variable names.</w:t>
-      </w:r>
-      <w:r>
-        <w:rPr>
-          <w:u w:val="none"/>
-        </w:rPr>
-        <w:t xml:space="preserve"> When we get to debugging, you’ll see that the debugger actually strips these symbols from the executable. </w:t>
-      </w:r>
-      <w:r>
-        <w:rPr>
-          <w:u w:val="none"/>
-        </w:rPr>
-        <w:t xml:space="preserve">The ldd command will tell you what libraries your executable depends on, simple as that. The strace utility shows a traceback of all the system calls that were made by your executable. Finally, ltrace will show a backtrace of all of the </w:t>
-      </w:r>
-      <w:r>
-        <w:rPr>
-          <w:u w:val="none"/>
-        </w:rPr>
-        <w:t>dynamic</w:t>
-      </w:r>
-      <w:r>
-        <w:rPr>
-          <w:u w:val="none"/>
-        </w:rPr>
-        <w:t xml:space="preserve"> library calls made by your executable.</w:t>
+        <w:t>It may be debated as to whether the loader is part of the compilation phase. Whether or not it is, I think it’s important that we learn about it, so I’m including it here. The loader is simply responsible for loading our executable code into memory. When you run ./exe the loader must create a new running process. Your process reserves a location in memory where the program stack (as well as for certain system resources that must be accessible to the process) will reside. It will then create a jump instruction to your program so that it can begin execution. Processes are a very complex topic which I plan to cover in the future (likely in the Linux document) so look out for that. Now that we have an executable, we can run the program. Here are some interesting commands to try on the command line: strings, file, readelf, ldd, ltrace, strace. The strings command will print out all ASCII strings within the executable file. Most of the file is binary garbage that we can’t read, but strings will find metadata which may be useful. Note that the only purpose of strings is to show you the strings that exist within the file, nothing more. The file command, as we seen, tells you more information about the file you give it Primarily it just tells you the type of file, but it may give you a varying degree of information depending on the file type. The readelf utility has a few different command line options which you can check out in the man pages. The -a option outputs all metadata. This utility is similar to objdump, but is specifically for ELF executables. It is most useful for showing us the debug symbols ie. the function and variable names. When we get to debugging, you’ll see that the debugger actually strips these symbols from the executable. The ldd command will tell you what libraries your executable depends on, simple as that. The strace utility shows a traceback of all the system calls that were made by your executable. Finally, ltrace will show a backtrace of all of the dynamic library calls made by your executable.</w:t>
       </w:r>
     </w:p>
     <w:p>
@@ -9541,18 +9083,7 @@
           <w:u w:val="none"/>
         </w:rPr>
         <w:tab/>
-      </w:r>
-      <w:r>
-        <w:rPr>
-          <w:u w:val="none"/>
-        </w:rPr>
-        <w:t>Forget OOP programming – C is NOT object oriented, it is entirely procedural</w:t>
-      </w:r>
-      <w:r>
-        <w:rPr>
-          <w:u w:val="none"/>
-        </w:rPr>
-        <w:t xml:space="preserve">. When I say object, I am referring to anything volatile which includes functions, variables, parameters, etc. Primarily, we will be focusing on variables in this section. We can think about an object in 3 different ways: The storage duration of the object, the scope of the object, and the linkage of the object. I will describe all three of these in detail, and then we can go over some examples. </w:t>
+        <w:t xml:space="preserve">Forget OOP programming – C is NOT object oriented, it is entirely procedural. When I say object, I am referring to anything volatile which includes functions, variables, parameters, etc. Primarily, we will be focusing on variables in this section. We can think about an object in 3 different ways: The storage duration of the object, the scope of the object, and the linkage of the object. I will describe all three of these in detail, and then we can go over some examples. </w:t>
       </w:r>
     </w:p>
     <w:p>
@@ -9625,23 +9156,7 @@
           <w:u w:val="none"/>
         </w:rPr>
         <w:tab/>
-        <w:t xml:space="preserve">Exists for the life of the program and </w:t>
-      </w:r>
-      <w:r>
-        <w:rPr>
-          <w:b w:val="false"/>
-          <w:bCs w:val="false"/>
-          <w:u w:val="none"/>
-        </w:rPr>
-        <w:t>its</w:t>
-      </w:r>
-      <w:r>
-        <w:rPr>
-          <w:b w:val="false"/>
-          <w:bCs w:val="false"/>
-          <w:u w:val="none"/>
-        </w:rPr>
-        <w:t xml:space="preserve"> address never changes</w:t>
+        <w:t>Exists for the life of the program and its address never changes</w:t>
       </w:r>
     </w:p>
     <w:p>
@@ -9665,23 +9180,7 @@
           <w:bCs w:val="false"/>
           <w:u w:val="none"/>
         </w:rPr>
-        <w:t xml:space="preserve"> </w:t>
-      </w:r>
-      <w:r>
-        <w:rPr>
-          <w:b w:val="false"/>
-          <w:bCs w:val="false"/>
-          <w:u w:val="none"/>
-        </w:rPr>
-        <w:t>Variables with a local scope, such as a function</w:t>
-      </w:r>
-      <w:r>
-        <w:rPr>
-          <w:b w:val="false"/>
-          <w:bCs w:val="false"/>
-          <w:u w:val="none"/>
-        </w:rPr>
-        <w:t xml:space="preserve">, register, or stack space </w:t>
+        <w:t xml:space="preserve"> Variables with a local scope, such as a function, register, or stack space </w:t>
       </w:r>
     </w:p>
     <w:p>
@@ -9770,55 +9269,7 @@
           <w:bCs w:val="false"/>
           <w:u w:val="none"/>
         </w:rPr>
-        <w:t xml:space="preserve">We will mostly be ignoring the thread duration, so we just need to remember that static means </w:t>
-      </w:r>
-      <w:r>
-        <w:rPr>
-          <w:b w:val="false"/>
-          <w:bCs w:val="false"/>
-          <w:u w:val="none"/>
-        </w:rPr>
-        <w:t xml:space="preserve">that </w:t>
-      </w:r>
-      <w:r>
-        <w:rPr>
-          <w:b w:val="false"/>
-          <w:bCs w:val="false"/>
-          <w:u w:val="none"/>
-        </w:rPr>
-        <w:t xml:space="preserve">the variable lasts for the duration of the program, automatic means that it lasts for the duration of the enclosing scope, and allocated means that it lasts until we call free() </w:t>
-      </w:r>
-      <w:r>
-        <w:rPr>
-          <w:b w:val="false"/>
-          <w:bCs w:val="false"/>
-          <w:u w:val="none"/>
-        </w:rPr>
-        <w:t>(</w:t>
-      </w:r>
-      <w:r>
-        <w:rPr>
-          <w:b w:val="false"/>
-          <w:bCs w:val="false"/>
-          <w:u w:val="none"/>
-        </w:rPr>
-        <w:t xml:space="preserve">or the process terminates and the OS </w:t>
-      </w:r>
-      <w:r>
-        <w:rPr>
-          <w:b w:val="false"/>
-          <w:bCs w:val="false"/>
-          <w:u w:val="none"/>
-        </w:rPr>
-        <w:t>retrieves it)</w:t>
-      </w:r>
-      <w:r>
-        <w:rPr>
-          <w:b w:val="false"/>
-          <w:bCs w:val="false"/>
-          <w:u w:val="none"/>
-        </w:rPr>
-        <w:t>.</w:t>
+        <w:t>We will mostly be ignoring the thread duration, so we just need to remember that static means that the variable lasts for the duration of the program, automatic means that it lasts for the duration of the enclosing scope, and allocated means that it lasts until we call free() (or the process terminates and the OS retrieves it).</w:t>
       </w:r>
     </w:p>
     <w:p>
@@ -9881,55 +9332,7 @@
           <w:u w:val="none"/>
         </w:rPr>
         <w:tab/>
-        <w:t xml:space="preserve">The scope of an object refers to its “visibility” ie. what </w:t>
-      </w:r>
-      <w:r>
-        <w:rPr>
-          <w:b w:val="false"/>
-          <w:bCs w:val="false"/>
-          <w:u w:val="none"/>
-        </w:rPr>
-        <w:t xml:space="preserve">the object </w:t>
-      </w:r>
-      <w:r>
-        <w:rPr>
-          <w:b w:val="false"/>
-          <w:bCs w:val="false"/>
-          <w:u w:val="none"/>
-        </w:rPr>
-        <w:t xml:space="preserve">is able to access and what </w:t>
-      </w:r>
-      <w:r>
-        <w:rPr>
-          <w:b w:val="false"/>
-          <w:bCs w:val="false"/>
-          <w:u w:val="none"/>
-        </w:rPr>
-        <w:t>other things are</w:t>
-      </w:r>
-      <w:r>
-        <w:rPr>
-          <w:b w:val="false"/>
-          <w:bCs w:val="false"/>
-          <w:u w:val="none"/>
-        </w:rPr>
-        <w:t xml:space="preserve"> able to access </w:t>
-      </w:r>
-      <w:r>
-        <w:rPr>
-          <w:b w:val="false"/>
-          <w:bCs w:val="false"/>
-          <w:u w:val="none"/>
-        </w:rPr>
-        <w:t>the object</w:t>
-      </w:r>
-      <w:r>
-        <w:rPr>
-          <w:b w:val="false"/>
-          <w:bCs w:val="false"/>
-          <w:u w:val="none"/>
-        </w:rPr>
-        <w:t>. There are 4 scopes that we can attribute to an object:</w:t>
+        <w:t>The scope of an object refers to its “visibility” ie. what the object is able to access and what other things are able to access the object. There are 4 scopes that we can attribute to an object:</w:t>
       </w:r>
     </w:p>
     <w:p>
@@ -9953,15 +9356,7 @@
           <w:bCs w:val="false"/>
           <w:u w:val="none"/>
         </w:rPr>
-        <w:t xml:space="preserve">The word function is quite misleading here. What we really mean is “labels” as in “goto” labels. </w:t>
-      </w:r>
-      <w:r>
-        <w:rPr>
-          <w:b w:val="false"/>
-          <w:bCs w:val="false"/>
-          <w:u w:val="none"/>
-        </w:rPr>
-        <w:t>If you’re not familiar with goto and/or goto labels, I recommend that you do a quick search online.</w:t>
+        <w:t>The word function is quite misleading here. What we really mean is “labels” as in “goto” labels. If you’re not familiar with goto and/or goto labels, I recommend that you do a quick search online.</w:t>
       </w:r>
     </w:p>
     <w:p>
@@ -9985,15 +9380,7 @@
           <w:bCs w:val="false"/>
           <w:u w:val="none"/>
         </w:rPr>
-        <w:t>Section b</w:t>
-      </w:r>
-      <w:r>
-        <w:rPr>
-          <w:b w:val="false"/>
-          <w:bCs w:val="false"/>
-          <w:u w:val="none"/>
-        </w:rPr>
-        <w:t>etween two curly braces {}</w:t>
+        <w:t>Section between two curly braces {}</w:t>
       </w:r>
     </w:p>
     <w:p>
@@ -10017,23 +9404,7 @@
           <w:bCs w:val="false"/>
           <w:u w:val="none"/>
         </w:rPr>
-        <w:t xml:space="preserve"> Anything within the </w:t>
-      </w:r>
-      <w:r>
-        <w:rPr>
-          <w:b w:val="false"/>
-          <w:bCs w:val="false"/>
-          <w:u w:val="none"/>
-        </w:rPr>
-        <w:t xml:space="preserve">enclosing </w:t>
-      </w:r>
-      <w:r>
-        <w:rPr>
-          <w:b w:val="false"/>
-          <w:bCs w:val="false"/>
-          <w:u w:val="none"/>
-        </w:rPr>
-        <w:t xml:space="preserve">file </w:t>
+        <w:t xml:space="preserve"> Anything within the enclosing file </w:t>
       </w:r>
     </w:p>
     <w:p>
@@ -10057,15 +9428,7 @@
           <w:bCs w:val="false"/>
           <w:u w:val="none"/>
         </w:rPr>
-        <w:t xml:space="preserve"> The thread </w:t>
-      </w:r>
-      <w:r>
-        <w:rPr>
-          <w:b w:val="false"/>
-          <w:bCs w:val="false"/>
-          <w:u w:val="none"/>
-        </w:rPr>
-        <w:t>that has ownership of the object</w:t>
+        <w:t xml:space="preserve"> The thread that has ownership of the object</w:t>
       </w:r>
     </w:p>
     <w:p>
@@ -10128,22 +9491,7 @@
           <w:u w:val="none"/>
         </w:rPr>
         <w:tab/>
-      </w:r>
-      <w:r>
-        <w:rPr>
-          <w:b w:val="false"/>
-          <w:bCs w:val="false"/>
-          <w:u w:val="none"/>
-        </w:rPr>
-        <w:t>L</w:t>
-      </w:r>
-      <w:r>
-        <w:rPr>
-          <w:b w:val="false"/>
-          <w:bCs w:val="false"/>
-          <w:u w:val="none"/>
-        </w:rPr>
-        <w:t>inkage refers to where the object is being linked from/to. There are technically 3 kinds of linkage:</w:t>
+        <w:t>Linkage refers to where the object is being linked from/to. There are technically 3 kinds of linkage:</w:t>
       </w:r>
     </w:p>
     <w:p>
@@ -10278,71 +9626,7 @@
           <w:u w:val="none"/>
         </w:rPr>
         <w:tab/>
-        <w:t xml:space="preserve">Remember how we just talked about storage duration? Well, C has some keywords </w:t>
-      </w:r>
-      <w:r>
-        <w:rPr>
-          <w:b w:val="false"/>
-          <w:bCs w:val="false"/>
-          <w:u w:val="none"/>
-        </w:rPr>
-        <w:t>known as “</w:t>
-      </w:r>
-      <w:r>
-        <w:rPr>
-          <w:b w:val="false"/>
-          <w:bCs w:val="false"/>
-          <w:u w:val="none"/>
-        </w:rPr>
-        <w:t xml:space="preserve">storage classes” </w:t>
-      </w:r>
-      <w:r>
-        <w:rPr>
-          <w:b w:val="false"/>
-          <w:bCs w:val="false"/>
-          <w:u w:val="none"/>
-        </w:rPr>
-        <w:t xml:space="preserve">which </w:t>
-      </w:r>
-      <w:r>
-        <w:rPr>
-          <w:b w:val="false"/>
-          <w:bCs w:val="false"/>
-          <w:u w:val="none"/>
-        </w:rPr>
-        <w:t xml:space="preserve">give our variables a specific storage duration. There are actually 5 storage classes, though most articles will tell you that there are only 4. Technically, there are only 4, but a fifth was added in C11, “thread_local”. I will cover all 5 here, but just </w:t>
-      </w:r>
-      <w:r>
-        <w:rPr>
-          <w:b w:val="false"/>
-          <w:bCs w:val="false"/>
-          <w:u w:val="none"/>
-        </w:rPr>
-        <w:t>be aware</w:t>
-      </w:r>
-      <w:r>
-        <w:rPr>
-          <w:b w:val="false"/>
-          <w:bCs w:val="false"/>
-          <w:u w:val="none"/>
-        </w:rPr>
-        <w:t xml:space="preserve"> that thread_local is </w:t>
-      </w:r>
-      <w:r>
-        <w:rPr>
-          <w:b w:val="false"/>
-          <w:bCs w:val="false"/>
-          <w:u w:val="none"/>
-        </w:rPr>
-        <w:t>not that</w:t>
-      </w:r>
-      <w:r>
-        <w:rPr>
-          <w:b w:val="false"/>
-          <w:bCs w:val="false"/>
-          <w:u w:val="none"/>
-        </w:rPr>
-        <w:t xml:space="preserve"> common.</w:t>
+        <w:t>Remember how we just talked about storage duration? Well, C has some keywords known as “storage classes” which give our variables a specific storage duration. There are actually 5 storage classes, though most articles will tell you that there are only 4. Technically, there are only 4, but a fifth was added in C11, “thread_local”. I will cover all 5 here, but just be aware that thread_local is not that common.</w:t>
       </w:r>
     </w:p>
     <w:p>
@@ -10384,28 +9668,7 @@
           <w:b w:val="false"/>
           <w:bCs w:val="false"/>
         </w:rPr>
-        <w:t xml:space="preserve">The auto keyword in C indicates that an object should have an automatic storage duration. In other words, it should live for the duration of the enclosing scope. If a variable has block scope, then it will be destroyed after the instruction pointer moves past the closing curly brace. </w:t>
-      </w:r>
-      <w:r>
-        <w:rPr>
-          <w:b w:val="false"/>
-          <w:bCs w:val="false"/>
-        </w:rPr>
-        <w:t>a</w:t>
-      </w:r>
-      <w:r>
-        <w:rPr>
-          <w:b w:val="false"/>
-          <w:bCs w:val="false"/>
-        </w:rPr>
-        <w:t xml:space="preserve">uto does not need to be declared explicitely in most cases. Any variable declared within block scope will be auto by default. When a variable is declared auto, the compiler reserves the appropriate amount of space based on the data type, but this will very likely be stale data that was left behind. We call this garbage data. Until we actually initialize the variable with some value, the variable will contain </w:t>
-      </w:r>
-      <w:r>
-        <w:rPr>
-          <w:b w:val="false"/>
-          <w:bCs w:val="false"/>
-        </w:rPr>
-        <w:t>a garbage value. For this reason, it is imperative that you initialize automatic variables before they are accessed/read.</w:t>
+        <w:t>The auto keyword in C indicates that an object should have an automatic storage duration. In other words, it should live for the duration of the enclosing scope. If a variable has block scope, then it will be destroyed after the instruction pointer moves past the closing curly brace. auto does not need to be declared explicitely in most cases. Any variable declared within block scope will be auto by default. When a variable is declared auto, the compiler reserves the appropriate amount of space based on the data type, but this will very likely be stale data that was left behind. We call this garbage data. Until we actually initialize the variable with some value, the variable will contain a garbage value. For this reason, it is imperative that you initialize automatic variables before they are accessed/read.</w:t>
       </w:r>
     </w:p>
     <w:p>
@@ -10445,63 +9708,7 @@
           <w:b w:val="false"/>
           <w:bCs w:val="false"/>
         </w:rPr>
-        <w:t xml:space="preserve"> The extern keyword along with the next keyword confuse many people. In essence, extern is a global value. Whilest the scope of extern is still within the file that the variable was declared in, it is possible to access extern variables from other files. </w:t>
-      </w:r>
-      <w:r>
-        <w:rPr>
-          <w:b w:val="false"/>
-          <w:bCs w:val="false"/>
-        </w:rPr>
-        <w:t>You may declare variables as extern</w:t>
-      </w:r>
-      <w:r>
-        <w:rPr>
-          <w:b w:val="false"/>
-          <w:bCs w:val="false"/>
-        </w:rPr>
-        <w:t xml:space="preserve"> within source files, but it is best </w:t>
-      </w:r>
-      <w:r>
-        <w:rPr>
-          <w:b w:val="false"/>
-          <w:bCs w:val="false"/>
-        </w:rPr>
-        <w:t xml:space="preserve">practice </w:t>
-      </w:r>
-      <w:r>
-        <w:rPr>
-          <w:b w:val="false"/>
-          <w:bCs w:val="false"/>
-        </w:rPr>
-        <w:t xml:space="preserve">to </w:t>
-      </w:r>
-      <w:r>
-        <w:rPr>
-          <w:b w:val="false"/>
-          <w:bCs w:val="false"/>
-        </w:rPr>
-        <w:t>declare them</w:t>
-      </w:r>
-      <w:r>
-        <w:rPr>
-          <w:b w:val="false"/>
-          <w:bCs w:val="false"/>
-        </w:rPr>
-        <w:t xml:space="preserve"> within header files. We will go over extern in more detail eventually. </w:t>
-      </w:r>
-      <w:r>
-        <w:rPr>
-          <w:b w:val="false"/>
-          <w:bCs w:val="false"/>
-        </w:rPr>
-        <w:t>e</w:t>
-      </w:r>
-      <w:r>
-        <w:rPr>
-          <w:b w:val="false"/>
-          <w:bCs w:val="false"/>
-        </w:rPr>
-        <w:t>xtern variables must be re-declared in every source file that uses them.</w:t>
+        <w:t xml:space="preserve"> The extern keyword along with the next keyword confuse many people. In essence, extern is a global value. Whilest the scope of extern is still within the file that the variable was declared in, it is possible to access extern variables from other files. You may declare variables as extern within source files, but it is best practice to declare them within header files. We will go over extern in more detail eventually. extern variables must be re-declared in every source file that uses them.</w:t>
       </w:r>
     </w:p>
     <w:p>
@@ -10541,91 +9748,7 @@
           <w:b w:val="false"/>
           <w:bCs w:val="false"/>
         </w:rPr>
-        <w:t xml:space="preserve">The other keyword that throws people off is static. The static storage class allows variables to remain </w:t>
-      </w:r>
-      <w:r>
-        <w:rPr>
-          <w:b w:val="false"/>
-          <w:bCs w:val="false"/>
-        </w:rPr>
-        <w:t xml:space="preserve">in existence </w:t>
-      </w:r>
-      <w:r>
-        <w:rPr>
-          <w:b w:val="false"/>
-          <w:bCs w:val="false"/>
-        </w:rPr>
-        <w:t xml:space="preserve">for the duration of the program. It’s linkage is </w:t>
-      </w:r>
-      <w:r>
-        <w:rPr>
-          <w:b w:val="false"/>
-          <w:bCs w:val="false"/>
-        </w:rPr>
-        <w:t>only local to the file that the variable is declared in</w:t>
-      </w:r>
-      <w:r>
-        <w:rPr>
-          <w:b w:val="false"/>
-          <w:bCs w:val="false"/>
-        </w:rPr>
-        <w:t xml:space="preserve">. That means that anything that tries to access a static variable outside of the translation unit that it was defined </w:t>
-      </w:r>
-      <w:r>
-        <w:rPr>
-          <w:b w:val="false"/>
-          <w:bCs w:val="false"/>
-        </w:rPr>
-        <w:t>i</w:t>
-      </w:r>
-      <w:r>
-        <w:rPr>
-          <w:b w:val="false"/>
-          <w:bCs w:val="false"/>
-        </w:rPr>
-        <w:t xml:space="preserve">n will fail because the linker was told not allow the static variable to be visible to other translation units. This also allows us to declare/define two functions or variables with the same name technically speaking (although that is not really its intended use). </w:t>
-      </w:r>
-      <w:r>
-        <w:rPr>
-          <w:b w:val="false"/>
-          <w:bCs w:val="false"/>
-        </w:rPr>
-        <w:t>s</w:t>
-      </w:r>
-      <w:r>
-        <w:rPr>
-          <w:b w:val="false"/>
-          <w:bCs w:val="false"/>
-        </w:rPr>
-        <w:t xml:space="preserve">tatic variables are initialized </w:t>
-      </w:r>
-      <w:r>
-        <w:rPr>
-          <w:b w:val="false"/>
-          <w:bCs w:val="false"/>
-        </w:rPr>
-        <w:t>to 0</w:t>
-      </w:r>
-      <w:r>
-        <w:rPr>
-          <w:b w:val="false"/>
-          <w:bCs w:val="false"/>
-        </w:rPr>
-        <w:t xml:space="preserve">, unlike auto and register keywords, </w:t>
-      </w:r>
-      <w:r>
-        <w:rPr>
-          <w:b w:val="false"/>
-          <w:bCs w:val="false"/>
-        </w:rPr>
-        <w:t>which are uninitialized, and therefore contain garbage</w:t>
-      </w:r>
-      <w:r>
-        <w:rPr>
-          <w:b w:val="false"/>
-          <w:bCs w:val="false"/>
-        </w:rPr>
-        <w:t xml:space="preserve">. </w:t>
+        <w:t xml:space="preserve">The other keyword that throws people off is static. The static storage class allows variables to remain in existence for the duration of the program. It’s linkage is only local to the file that the variable is declared in. That means that anything that tries to access a static variable outside of the translation unit that it was defined in will fail because the linker was told not allow the static variable to be visible to other translation units. This also allows us to declare/define two functions or variables with the same name technically speaking (although that is not really its intended use). static variables are initialized to 0, unlike auto and register keywords, which are uninitialized, and therefore contain garbage. </w:t>
       </w:r>
     </w:p>
     <w:p>
@@ -10665,77 +9788,7 @@
           <w:b w:val="false"/>
           <w:bCs w:val="false"/>
         </w:rPr>
-        <w:t xml:space="preserve"> </w:t>
-      </w:r>
-      <w:r>
-        <w:rPr>
-          <w:b w:val="false"/>
-          <w:bCs w:val="false"/>
-        </w:rPr>
-        <w:t>The r</w:t>
-      </w:r>
-      <w:r>
-        <w:rPr>
-          <w:b w:val="false"/>
-          <w:bCs w:val="false"/>
-        </w:rPr>
-        <w:t xml:space="preserve">egister </w:t>
-      </w:r>
-      <w:r>
-        <w:rPr>
-          <w:b w:val="false"/>
-          <w:bCs w:val="false"/>
-        </w:rPr>
-        <w:t>keyword</w:t>
-      </w:r>
-      <w:r>
-        <w:rPr>
-          <w:b w:val="false"/>
-          <w:bCs w:val="false"/>
-        </w:rPr>
-        <w:t xml:space="preserve"> is seldomly used, but we will cover it anyways. register will make a suggestion to the compiler to put a variable within one of its registers (we have no control over which </w:t>
-      </w:r>
-      <w:r>
-        <w:rPr>
-          <w:b w:val="false"/>
-          <w:bCs w:val="false"/>
-        </w:rPr>
-        <w:t>register</w:t>
-      </w:r>
-      <w:r>
-        <w:rPr>
-          <w:b w:val="false"/>
-          <w:bCs w:val="false"/>
-        </w:rPr>
-        <w:t xml:space="preserve">). </w:t>
-      </w:r>
-      <w:r>
-        <w:rPr>
-          <w:b w:val="false"/>
-          <w:bCs w:val="false"/>
-        </w:rPr>
-        <w:t>This is useful in</w:t>
-      </w:r>
-      <w:r>
-        <w:rPr>
-          <w:b w:val="false"/>
-          <w:bCs w:val="false"/>
-        </w:rPr>
-        <w:t xml:space="preserve"> the case that we know th</w:t>
-      </w:r>
-      <w:r>
-        <w:rPr>
-          <w:b w:val="false"/>
-          <w:bCs w:val="false"/>
-        </w:rPr>
-        <w:t>at the</w:t>
-      </w:r>
-      <w:r>
-        <w:rPr>
-          <w:b w:val="false"/>
-          <w:bCs w:val="false"/>
-        </w:rPr>
-        <w:t xml:space="preserve"> variable is about to be used a </w:t>
+        <w:t xml:space="preserve"> The register keyword is seldomly used, but we will cover it anyways. register will make a suggestion to the compiler to put a variable within one of its registers (we have no control over which register). This is useful in the case that we know that the variable is about to be used a </w:t>
       </w:r>
       <w:r>
         <w:rPr>
@@ -10753,97 +9806,7 @@
           <w:i w:val="false"/>
           <w:iCs w:val="false"/>
         </w:rPr>
-        <w:t xml:space="preserve">. Be humble though, the compiler is way smarter than you, and can optimize better than you, so in all likelyhood, it will </w:t>
-      </w:r>
-      <w:r>
-        <w:rPr>
-          <w:b w:val="false"/>
-          <w:bCs w:val="false"/>
-          <w:i w:val="false"/>
-          <w:iCs w:val="false"/>
-        </w:rPr>
-        <w:t>already have placed</w:t>
-      </w:r>
-      <w:r>
-        <w:rPr>
-          <w:b w:val="false"/>
-          <w:bCs w:val="false"/>
-          <w:i w:val="false"/>
-          <w:iCs w:val="false"/>
-        </w:rPr>
-        <w:t xml:space="preserve"> </w:t>
-      </w:r>
-      <w:r>
-        <w:rPr>
-          <w:b w:val="false"/>
-          <w:bCs w:val="false"/>
-          <w:i w:val="false"/>
-          <w:iCs w:val="false"/>
-        </w:rPr>
-        <w:t xml:space="preserve">the </w:t>
-      </w:r>
-      <w:r>
-        <w:rPr>
-          <w:b w:val="false"/>
-          <w:bCs w:val="false"/>
-          <w:i w:val="false"/>
-          <w:iCs w:val="false"/>
-        </w:rPr>
-        <w:t>highe</w:t>
-      </w:r>
-      <w:r>
-        <w:rPr>
-          <w:b w:val="false"/>
-          <w:bCs w:val="false"/>
-          <w:i w:val="false"/>
-          <w:iCs w:val="false"/>
-        </w:rPr>
-        <w:t>st</w:t>
-      </w:r>
-      <w:r>
-        <w:rPr>
-          <w:b w:val="false"/>
-          <w:bCs w:val="false"/>
-          <w:i w:val="false"/>
-          <w:iCs w:val="false"/>
-        </w:rPr>
-        <w:t xml:space="preserve"> priority items </w:t>
-      </w:r>
-      <w:r>
-        <w:rPr>
-          <w:b w:val="false"/>
-          <w:bCs w:val="false"/>
-          <w:i w:val="false"/>
-          <w:iCs w:val="false"/>
-        </w:rPr>
-        <w:t>in the CPU’s</w:t>
-      </w:r>
-      <w:r>
-        <w:rPr>
-          <w:b w:val="false"/>
-          <w:bCs w:val="false"/>
-          <w:i w:val="false"/>
-          <w:iCs w:val="false"/>
-        </w:rPr>
-        <w:t xml:space="preserve"> registers. </w:t>
-      </w:r>
-      <w:r>
-        <w:rPr>
-          <w:b w:val="false"/>
-          <w:bCs w:val="false"/>
-          <w:i w:val="false"/>
-          <w:iCs w:val="false"/>
-        </w:rPr>
-        <w:t>r</w:t>
-      </w:r>
-      <w:r>
-        <w:rPr>
-          <w:b w:val="false"/>
-          <w:bCs w:val="false"/>
-          <w:i w:val="false"/>
-          <w:iCs w:val="false"/>
-        </w:rPr>
-        <w:t xml:space="preserve">egister is barely ever used because the compiler will typically optimize this for you anyways, so don’t worry about it too much. Just know that it exists, and perhaps you may even stumble across it in some production code one day. </w:t>
+        <w:t xml:space="preserve">. Be humble though, the compiler is way smarter than you, and can optimize better than you, so in all likelyhood, it will already have placed the highest priority items in the CPU’s registers. register is barely ever used because the compiler will typically optimize this for you anyways, so don’t worry about it too much. Just know that it exists, and perhaps you may even stumble across it in some production code one day. </w:t>
       </w:r>
     </w:p>
     <w:p>
@@ -10892,25 +9855,7 @@
           <w:i w:val="false"/>
           <w:iCs w:val="false"/>
         </w:rPr>
-        <w:t xml:space="preserve"> As of C11, the </w:t>
-      </w:r>
-      <w:r>
-        <w:rPr>
-          <w:b w:val="false"/>
-          <w:bCs w:val="false"/>
-          <w:i w:val="false"/>
-          <w:iCs w:val="false"/>
-        </w:rPr>
-        <w:t>t</w:t>
-      </w:r>
-      <w:r>
-        <w:rPr>
-          <w:b w:val="false"/>
-          <w:bCs w:val="false"/>
-          <w:i w:val="false"/>
-          <w:iCs w:val="false"/>
-        </w:rPr>
-        <w:t xml:space="preserve">hread_local storage class was added. The main idea is that the object will last for the lifetime of the thread. If a thread dies, then so do the variables within it – simple as that!  The objects value is initialized when the thread is started, and cleaned up when the thread dies. </w:t>
+        <w:t xml:space="preserve"> As of C11, the thread_local storage class was added. The main idea is that the object will last for the lifetime of the thread. If a thread dies, then so do the variables within it – simple as that!  The objects value is initialized when the thread is started, and cleaned up when the thread dies. </w:t>
       </w:r>
     </w:p>
     <w:p>
@@ -11387,47 +10332,7 @@
           <w:iCs w:val="false"/>
           <w:u w:val="none"/>
         </w:rPr>
-        <w:t xml:space="preserve">Hopefully most of these are apparent to you. The first </w:t>
-      </w:r>
-      <w:r>
-        <w:rPr>
-          <w:b w:val="false"/>
-          <w:bCs w:val="false"/>
-          <w:i w:val="false"/>
-          <w:iCs w:val="false"/>
-          <w:u w:val="none"/>
-        </w:rPr>
-        <w:t>4</w:t>
-      </w:r>
-      <w:r>
-        <w:rPr>
-          <w:b w:val="false"/>
-          <w:bCs w:val="false"/>
-          <w:i w:val="false"/>
-          <w:iCs w:val="false"/>
-          <w:u w:val="none"/>
-        </w:rPr>
-        <w:t xml:space="preserve"> of variables </w:t>
-      </w:r>
-      <w:r>
-        <w:rPr>
-          <w:b w:val="false"/>
-          <w:bCs w:val="false"/>
-          <w:i w:val="false"/>
-          <w:iCs w:val="false"/>
-          <w:u w:val="none"/>
-        </w:rPr>
-        <w:t>are declared outside of any block, meaning that they must all have</w:t>
-      </w:r>
-      <w:r>
-        <w:rPr>
-          <w:b w:val="false"/>
-          <w:bCs w:val="false"/>
-          <w:i w:val="false"/>
-          <w:iCs w:val="false"/>
-          <w:u w:val="none"/>
-        </w:rPr>
-        <w:t xml:space="preserve"> file scope (other than thread which is unique). The second set of variables </w:t>
+        <w:t xml:space="preserve">Hopefully most of these are apparent to you. The first 4 of variables are declared outside of any block, meaning that they must all have file scope (other than thread which is unique). The second set of variables </w:t>
       </w:r>
       <w:r>
         <w:rPr>
@@ -11447,47 +10352,7 @@
           <w:iCs w:val="false"/>
           <w:u w:val="none"/>
         </w:rPr>
-        <w:t xml:space="preserve"> declared within a block {} so they have block scope. All of the static variables have internal linkage, and all of the external variables have external linkage, otherwise the linkage is none. If you are wondering why </w:t>
-      </w:r>
-      <w:r>
-        <w:rPr>
-          <w:b w:val="false"/>
-          <w:bCs w:val="false"/>
-          <w:i w:val="false"/>
-          <w:iCs w:val="false"/>
-          <w:u w:val="none"/>
-        </w:rPr>
-        <w:t xml:space="preserve">the first </w:t>
-      </w:r>
-      <w:r>
-        <w:rPr>
-          <w:b w:val="false"/>
-          <w:bCs w:val="false"/>
-          <w:i w:val="false"/>
-          <w:iCs w:val="false"/>
-          <w:u w:val="none"/>
-        </w:rPr>
-        <w:t xml:space="preserve">int has external linkage, it is simply because that is the default for variables declared outside of </w:t>
-      </w:r>
-      <w:r>
-        <w:rPr>
-          <w:b w:val="false"/>
-          <w:bCs w:val="false"/>
-          <w:i w:val="false"/>
-          <w:iCs w:val="false"/>
-          <w:u w:val="none"/>
-        </w:rPr>
-        <w:t>a block</w:t>
-      </w:r>
-      <w:r>
-        <w:rPr>
-          <w:b w:val="false"/>
-          <w:bCs w:val="false"/>
-          <w:i w:val="false"/>
-          <w:iCs w:val="false"/>
-          <w:u w:val="none"/>
-        </w:rPr>
-        <w:t xml:space="preserve">, similar to how auto is the default for variables declared within functions. As for storage duration, this mainly depends on whether or not the variable was declared within a block. If it was declared within a block and has no special storage class, then it is auto, otherwise it will be static (with the exception of thread_local variables). </w:t>
+        <w:t xml:space="preserve"> declared within a block {} so they have block scope. All of the static variables have internal linkage, and all of the external variables have external linkage, otherwise the linkage is none. If you are wondering why the first int has external linkage, it is simply because that is the default for variables declared outside of a block, similar to how auto is the default for variables declared within functions. As for storage duration, this mainly depends on whether or not the variable was declared within a block. If it was declared within a block and has no special storage class, then it is auto, otherwise it will be static (with the exception of thread_local variables). </w:t>
       </w:r>
     </w:p>
     <w:p>
@@ -11616,265 +10481,85 @@
           <w:iCs w:val="false"/>
           <w:u w:val="single"/>
         </w:rPr>
-        <w:t>c</w:t>
-      </w:r>
-      <w:r>
-        <w:rPr>
-          <w:b w:val="false"/>
-          <w:bCs w:val="false"/>
-          <w:i w:val="false"/>
-          <w:iCs w:val="false"/>
-          <w:u w:val="single"/>
-        </w:rPr>
-        <w:t>onst:</w:t>
-      </w:r>
-    </w:p>
-    <w:p>
-      <w:pPr>
-        <w:pStyle w:val="TextBody"/>
-        <w:spacing w:before="0" w:after="140"/>
-        <w:ind w:left="0" w:hanging="0"/>
-        <w:rPr>
-          <w:b w:val="false"/>
-          <w:b w:val="false"/>
-          <w:bCs w:val="false"/>
-          <w:i w:val="false"/>
-          <w:i w:val="false"/>
-          <w:iCs w:val="false"/>
-          <w:u w:val="none"/>
-        </w:rPr>
-      </w:pPr>
-      <w:r>
-        <w:rPr>
-          <w:b w:val="false"/>
-          <w:bCs w:val="false"/>
-          <w:i w:val="false"/>
-          <w:iCs w:val="false"/>
-          <w:u w:val="none"/>
-        </w:rPr>
-        <w:tab/>
-        <w:t xml:space="preserve">The const keyword is common in many programming languages. In Java, const is known as “final”. </w:t>
-      </w:r>
-      <w:r>
-        <w:rPr>
-          <w:b w:val="false"/>
-          <w:bCs w:val="false"/>
-          <w:i w:val="false"/>
-          <w:iCs w:val="false"/>
-          <w:u w:val="none"/>
-        </w:rPr>
-        <w:t>c</w:t>
-      </w:r>
-      <w:r>
-        <w:rPr>
-          <w:b w:val="false"/>
-          <w:bCs w:val="false"/>
-          <w:i w:val="false"/>
-          <w:iCs w:val="false"/>
-          <w:u w:val="none"/>
-        </w:rPr>
-        <w:t xml:space="preserve">onst stands for constant, meaning that the value of the variable should not be altered. While const is a very good safegaurd, it is certainly not bullet proof. There are still ways to forcibly write a new value into a variable that is marked const. Often times, begginers get confused between const and macros. The difference </w:t>
-      </w:r>
-      <w:r>
-        <w:rPr>
-          <w:b w:val="false"/>
-          <w:bCs w:val="false"/>
-          <w:i w:val="false"/>
-          <w:iCs w:val="false"/>
-          <w:u w:val="none"/>
-        </w:rPr>
-        <w:t>between macros and variables marked as const</w:t>
-      </w:r>
-      <w:r>
-        <w:rPr>
-          <w:b w:val="false"/>
-          <w:bCs w:val="false"/>
-          <w:i w:val="false"/>
-          <w:iCs w:val="false"/>
-          <w:u w:val="none"/>
-        </w:rPr>
-        <w:t xml:space="preserve"> is quite significant, and we need to be careful not to conflate the two. Firstly, macros are expanded during the pre-processor phase, while const values are evaluated at compile time. Secondly, macros do not have a data type, but const variables do. Thirdly, macros cannot be altered unless they are #endef(ined) and #defined(d) again. </w:t>
-      </w:r>
-      <w:r>
-        <w:rPr>
-          <w:b w:val="false"/>
-          <w:bCs w:val="false"/>
-          <w:i w:val="false"/>
-          <w:iCs w:val="false"/>
-          <w:u w:val="none"/>
-        </w:rPr>
-        <w:t>c</w:t>
-      </w:r>
-      <w:r>
-        <w:rPr>
-          <w:b w:val="false"/>
-          <w:bCs w:val="false"/>
-          <w:i w:val="false"/>
-          <w:iCs w:val="false"/>
-          <w:u w:val="none"/>
-        </w:rPr>
-        <w:t xml:space="preserve">onst variables on the other hand, can be forcibly altered using what we call pointers (which we will get into soon enough). When we get to arrays, you will note that their size is always </w:t>
-      </w:r>
-      <w:r>
-        <w:rPr>
-          <w:b w:val="false"/>
-          <w:bCs w:val="false"/>
-          <w:i w:val="false"/>
-          <w:iCs w:val="false"/>
-          <w:u w:val="none"/>
-        </w:rPr>
-        <w:t xml:space="preserve">either </w:t>
-      </w:r>
-      <w:r>
-        <w:rPr>
-          <w:b w:val="false"/>
-          <w:bCs w:val="false"/>
-          <w:i w:val="false"/>
-          <w:iCs w:val="false"/>
-          <w:u w:val="none"/>
-        </w:rPr>
-        <w:t xml:space="preserve">specified with a macro, </w:t>
-      </w:r>
-      <w:r>
-        <w:rPr>
-          <w:b w:val="false"/>
-          <w:bCs w:val="false"/>
-          <w:i w:val="false"/>
-          <w:iCs w:val="false"/>
-          <w:u w:val="none"/>
-        </w:rPr>
-        <w:t>or a numeric literal</w:t>
-      </w:r>
-      <w:r>
-        <w:rPr>
-          <w:b w:val="false"/>
-          <w:bCs w:val="false"/>
-          <w:i w:val="false"/>
-          <w:iCs w:val="false"/>
-          <w:u w:val="none"/>
-        </w:rPr>
-        <w:t xml:space="preserve">. This is because the compiler can trust that the macro will not change between compile time and runtime, but it cannot </w:t>
-      </w:r>
-      <w:r>
-        <w:rPr>
-          <w:b w:val="false"/>
-          <w:bCs w:val="false"/>
-          <w:i w:val="false"/>
-          <w:iCs w:val="false"/>
-          <w:u w:val="none"/>
-        </w:rPr>
-        <w:t>make the same guarantee for variables marked const, since a const variable could technically be altered prior to the initialization of the array</w:t>
-      </w:r>
-      <w:r>
-        <w:rPr>
-          <w:b w:val="false"/>
-          <w:bCs w:val="false"/>
-          <w:i w:val="false"/>
-          <w:iCs w:val="false"/>
-          <w:u w:val="none"/>
-        </w:rPr>
-        <w:t xml:space="preserve">. While it </w:t>
-      </w:r>
-      <w:r>
-        <w:rPr>
-          <w:b w:val="false"/>
-          <w:bCs w:val="false"/>
-          <w:i w:val="false"/>
-          <w:iCs w:val="false"/>
-          <w:u w:val="none"/>
-        </w:rPr>
-        <w:t>can be</w:t>
-      </w:r>
-      <w:r>
-        <w:rPr>
-          <w:b w:val="false"/>
-          <w:bCs w:val="false"/>
-          <w:i w:val="false"/>
-          <w:iCs w:val="false"/>
-          <w:u w:val="none"/>
-        </w:rPr>
-        <w:t xml:space="preserve"> tedious to add const everywhere, it should be used judiciously </w:t>
-      </w:r>
-      <w:r>
-        <w:rPr>
-          <w:b w:val="false"/>
-          <w:bCs w:val="false"/>
-          <w:i w:val="false"/>
-          <w:iCs w:val="false"/>
-          <w:u w:val="none"/>
-        </w:rPr>
-        <w:t>for variables and parameters that do not need to be altered</w:t>
-      </w:r>
-      <w:r>
-        <w:rPr>
-          <w:b w:val="false"/>
-          <w:bCs w:val="false"/>
-          <w:i w:val="false"/>
-          <w:iCs w:val="false"/>
-          <w:u w:val="none"/>
-        </w:rPr>
-        <w:t>.</w:t>
-      </w:r>
-    </w:p>
-    <w:p>
-      <w:pPr>
-        <w:pStyle w:val="TextBody"/>
-        <w:spacing w:before="0" w:after="140"/>
-        <w:ind w:left="0" w:hanging="0"/>
-        <w:rPr>
-          <w:b w:val="false"/>
-          <w:b w:val="false"/>
-          <w:bCs w:val="false"/>
-          <w:i w:val="false"/>
-          <w:i w:val="false"/>
-          <w:iCs w:val="false"/>
-          <w:u w:val="none"/>
-        </w:rPr>
-      </w:pPr>
-      <w:r>
-        <w:rPr>
-          <w:b w:val="false"/>
-          <w:bCs w:val="false"/>
-          <w:i w:val="false"/>
-          <w:iCs w:val="false"/>
-          <w:u w:val="none"/>
-        </w:rPr>
-      </w:r>
-    </w:p>
-    <w:p>
-      <w:pPr>
-        <w:pStyle w:val="TextBody"/>
-        <w:spacing w:before="0" w:after="140"/>
-        <w:ind w:left="0" w:hanging="0"/>
-        <w:rPr>
-          <w:b w:val="false"/>
-          <w:b w:val="false"/>
-          <w:bCs w:val="false"/>
-          <w:i w:val="false"/>
-          <w:i w:val="false"/>
-          <w:iCs w:val="false"/>
-          <w:u w:val="single"/>
-        </w:rPr>
-      </w:pPr>
-      <w:r>
-        <w:rPr>
-          <w:b w:val="false"/>
-          <w:bCs w:val="false"/>
-          <w:i w:val="false"/>
-          <w:iCs w:val="false"/>
-          <w:u w:val="single"/>
-        </w:rPr>
-        <w:t>v</w:t>
-      </w:r>
-      <w:r>
-        <w:rPr>
-          <w:b w:val="false"/>
-          <w:bCs w:val="false"/>
-          <w:i w:val="false"/>
-          <w:iCs w:val="false"/>
-          <w:u w:val="single"/>
-        </w:rPr>
-        <w:t>olatile:</w:t>
+        <w:t>const:</w:t>
+      </w:r>
+    </w:p>
+    <w:p>
+      <w:pPr>
+        <w:pStyle w:val="TextBody"/>
+        <w:spacing w:before="0" w:after="140"/>
+        <w:ind w:left="0" w:hanging="0"/>
+        <w:rPr>
+          <w:b w:val="false"/>
+          <w:b w:val="false"/>
+          <w:bCs w:val="false"/>
+          <w:i w:val="false"/>
+          <w:i w:val="false"/>
+          <w:iCs w:val="false"/>
+          <w:u w:val="none"/>
+        </w:rPr>
+      </w:pPr>
+      <w:r>
+        <w:rPr>
+          <w:b w:val="false"/>
+          <w:bCs w:val="false"/>
+          <w:i w:val="false"/>
+          <w:iCs w:val="false"/>
+          <w:u w:val="none"/>
+        </w:rPr>
+        <w:tab/>
+        <w:t>The const keyword is common in many programming languages. In Java, const is known as “final”. const stands for constant, meaning that the value of the variable should not be altered. While const is a very good safegaurd, it is certainly not bullet proof. There are still ways to forcibly write a new value into a variable that is marked const. Often times, begginers get confused between const and macros. The difference between macros and variables marked as const is quite significant, and we need to be careful not to conflate the two. Firstly, macros are expanded during the pre-processor phase, while const values are evaluated at compile time. Secondly, macros do not have a data type, but const variables do. Thirdly, macros cannot be altered unless they are #endef(ined) and #defined(d) again. const variables on the other hand, can be forcibly altered using what we call pointers (which we will get into soon enough). When we get to arrays, you will note that their size is always either specified with a macro, or a numeric literal. This is because the compiler can trust that the macro will not change between compile time and runtime, but it cannot make the same guarantee for variables marked const, since a const variable could technically be altered prior to the initialization of the array. While it can be tedious to add const everywhere, it should be used judiciously for variables and parameters that do not need to be altered.</w:t>
+      </w:r>
+    </w:p>
+    <w:p>
+      <w:pPr>
+        <w:pStyle w:val="TextBody"/>
+        <w:spacing w:before="0" w:after="140"/>
+        <w:ind w:left="0" w:hanging="0"/>
+        <w:rPr>
+          <w:b w:val="false"/>
+          <w:b w:val="false"/>
+          <w:bCs w:val="false"/>
+          <w:i w:val="false"/>
+          <w:i w:val="false"/>
+          <w:iCs w:val="false"/>
+          <w:u w:val="none"/>
+        </w:rPr>
+      </w:pPr>
+      <w:r>
+        <w:rPr>
+          <w:b w:val="false"/>
+          <w:bCs w:val="false"/>
+          <w:i w:val="false"/>
+          <w:iCs w:val="false"/>
+          <w:u w:val="none"/>
+        </w:rPr>
+      </w:r>
+    </w:p>
+    <w:p>
+      <w:pPr>
+        <w:pStyle w:val="TextBody"/>
+        <w:spacing w:before="0" w:after="140"/>
+        <w:ind w:left="0" w:hanging="0"/>
+        <w:rPr>
+          <w:b w:val="false"/>
+          <w:b w:val="false"/>
+          <w:bCs w:val="false"/>
+          <w:i w:val="false"/>
+          <w:i w:val="false"/>
+          <w:iCs w:val="false"/>
+          <w:u w:val="single"/>
+        </w:rPr>
+      </w:pPr>
+      <w:r>
+        <w:rPr>
+          <w:b w:val="false"/>
+          <w:bCs w:val="false"/>
+          <w:i w:val="false"/>
+          <w:iCs w:val="false"/>
+          <w:u w:val="single"/>
+        </w:rPr>
+        <w:t>volatile:</w:t>
       </w:r>
     </w:p>
     <w:p>
@@ -11893,87 +10578,7 @@
           <w:u w:val="none"/>
         </w:rPr>
         <w:tab/>
-        <w:t>The volatile keyword is quite interesting – albeit a bit niche. The compiler attempts to optimize variables under the assumption that the only thing which can alter their value is the main thread of execution. However, there are external resources (</w:t>
-      </w:r>
-      <w:r>
-        <w:rPr>
-          <w:b w:val="false"/>
-          <w:bCs w:val="false"/>
-          <w:i w:val="false"/>
-          <w:iCs w:val="false"/>
-          <w:u w:val="none"/>
-        </w:rPr>
-        <w:t>typically</w:t>
-      </w:r>
-      <w:r>
-        <w:rPr>
-          <w:b w:val="false"/>
-          <w:bCs w:val="false"/>
-          <w:i w:val="false"/>
-          <w:iCs w:val="false"/>
-          <w:u w:val="none"/>
-        </w:rPr>
-        <w:t xml:space="preserve"> other threads) which can alter the state of a variable without the </w:t>
-      </w:r>
-      <w:r>
-        <w:rPr>
-          <w:b w:val="false"/>
-          <w:bCs w:val="false"/>
-          <w:i w:val="false"/>
-          <w:iCs w:val="false"/>
-          <w:u w:val="none"/>
-        </w:rPr>
-        <w:t>primary</w:t>
-      </w:r>
-      <w:r>
-        <w:rPr>
-          <w:b w:val="false"/>
-          <w:bCs w:val="false"/>
-          <w:i w:val="false"/>
-          <w:iCs w:val="false"/>
-          <w:u w:val="none"/>
-        </w:rPr>
-        <w:t xml:space="preserve"> thread’s knowledge. </w:t>
-      </w:r>
-      <w:r>
-        <w:rPr>
-          <w:b w:val="false"/>
-          <w:bCs w:val="false"/>
-          <w:i w:val="false"/>
-          <w:iCs w:val="false"/>
-          <w:u w:val="none"/>
-        </w:rPr>
-        <w:t>The v</w:t>
-      </w:r>
-      <w:r>
-        <w:rPr>
-          <w:b w:val="false"/>
-          <w:bCs w:val="false"/>
-          <w:i w:val="false"/>
-          <w:iCs w:val="false"/>
-          <w:u w:val="none"/>
-        </w:rPr>
-        <w:t xml:space="preserve">olatile </w:t>
-      </w:r>
-      <w:r>
-        <w:rPr>
-          <w:b w:val="false"/>
-          <w:bCs w:val="false"/>
-          <w:i w:val="false"/>
-          <w:iCs w:val="false"/>
-          <w:u w:val="none"/>
-        </w:rPr>
-        <w:t xml:space="preserve">keyword </w:t>
-      </w:r>
-      <w:r>
-        <w:rPr>
-          <w:b w:val="false"/>
-          <w:bCs w:val="false"/>
-          <w:i w:val="false"/>
-          <w:iCs w:val="false"/>
-          <w:u w:val="none"/>
-        </w:rPr>
-        <w:t>tells the compiler not to make such optimizations on the variable. It says “you</w:t>
+        <w:t>The volatile keyword is quite interesting – albeit a bit niche. The compiler attempts to optimize variables under the assumption that the only thing which can alter their value is the main thread of execution. However, there are external resources (typically other threads) which can alter the state of a variable without the primary thread’s knowledge. The volatile keyword tells the compiler not to make such optimizations on the variable. It says “you</w:t>
       </w:r>
       <w:r>
         <w:rPr>
@@ -11993,27 +10598,7 @@
           <w:iCs w:val="false"/>
           <w:u w:val="none"/>
         </w:rPr>
-        <w:t xml:space="preserve"> check the value of this variable each and every time that you read from it”. The main use for volatile is for multi-threaded programs, </w:t>
-      </w:r>
-      <w:r>
-        <w:rPr>
-          <w:b w:val="false"/>
-          <w:bCs w:val="false"/>
-          <w:i w:val="false"/>
-          <w:iCs w:val="false"/>
-          <w:u w:val="none"/>
-        </w:rPr>
-        <w:t>as I’ve already implied</w:t>
-      </w:r>
-      <w:r>
-        <w:rPr>
-          <w:b w:val="false"/>
-          <w:bCs w:val="false"/>
-          <w:i w:val="false"/>
-          <w:iCs w:val="false"/>
-          <w:u w:val="none"/>
-        </w:rPr>
-        <w:t>. If another thread alters the state of a variable, then we want to be reading that variable every time expecting a change. Outside of multi-threading, volatile is not heavily used, so don’t worry about it too much.</w:t>
+        <w:t xml:space="preserve"> check the value of this variable each and every time that you read from it”. The main use for volatile is for multi-threaded programs, as I’ve already implied. If another thread alters the state of a variable, then we want to be reading that variable every time expecting a change. Outside of multi-threading, volatile is not heavily used, so don’t worry about it too much.</w:t>
       </w:r>
     </w:p>
     <w:p>
@@ -12091,147 +10676,7 @@
           <w:u w:val="none"/>
         </w:rPr>
         <w:tab/>
-        <w:t xml:space="preserve">We haven’t discussed pointers yet, as I’ve already mentioned, but in short, a pointer is a variable that acts as a </w:t>
-      </w:r>
-      <w:r>
-        <w:rPr>
-          <w:b w:val="false"/>
-          <w:bCs w:val="false"/>
-          <w:i w:val="false"/>
-          <w:iCs w:val="false"/>
-          <w:u w:val="none"/>
-        </w:rPr>
-        <w:t>pipe</w:t>
-      </w:r>
-      <w:r>
-        <w:rPr>
-          <w:b w:val="false"/>
-          <w:bCs w:val="false"/>
-          <w:i w:val="false"/>
-          <w:iCs w:val="false"/>
-          <w:u w:val="none"/>
-        </w:rPr>
-        <w:t xml:space="preserve"> towards another variable’s data. By accessing the pointer, we can access the variable that it points to. </w:t>
-      </w:r>
-      <w:r>
-        <w:rPr>
-          <w:b w:val="false"/>
-          <w:bCs w:val="false"/>
-          <w:i w:val="false"/>
-          <w:iCs w:val="false"/>
-          <w:u w:val="none"/>
-        </w:rPr>
-        <w:t>r</w:t>
-      </w:r>
-      <w:r>
-        <w:rPr>
-          <w:b w:val="false"/>
-          <w:bCs w:val="false"/>
-          <w:i w:val="false"/>
-          <w:iCs w:val="false"/>
-          <w:u w:val="none"/>
-        </w:rPr>
-        <w:t xml:space="preserve">estrict </w:t>
-      </w:r>
-      <w:r>
-        <w:rPr>
-          <w:b w:val="false"/>
-          <w:bCs w:val="false"/>
-          <w:i w:val="false"/>
-          <w:iCs w:val="false"/>
-          <w:u w:val="none"/>
-        </w:rPr>
-        <w:t>is given to a pointer, and tells the compiler that that pointer</w:t>
-      </w:r>
-      <w:r>
-        <w:rPr>
-          <w:b w:val="false"/>
-          <w:bCs w:val="false"/>
-          <w:i w:val="false"/>
-          <w:iCs w:val="false"/>
-          <w:u w:val="none"/>
-        </w:rPr>
-        <w:t xml:space="preserve"> is the only method of accessing the data </w:t>
-      </w:r>
-      <w:r>
-        <w:rPr>
-          <w:b w:val="false"/>
-          <w:bCs w:val="false"/>
-          <w:i w:val="false"/>
-          <w:iCs w:val="false"/>
-          <w:u w:val="none"/>
-        </w:rPr>
-        <w:t>of</w:t>
-      </w:r>
-      <w:r>
-        <w:rPr>
-          <w:b w:val="false"/>
-          <w:bCs w:val="false"/>
-          <w:i w:val="false"/>
-          <w:iCs w:val="false"/>
-          <w:u w:val="none"/>
-        </w:rPr>
-        <w:t xml:space="preserve"> the variable that it’s pointing to. In other words, we use this if </w:t>
-      </w:r>
-      <w:r>
-        <w:rPr>
-          <w:b w:val="false"/>
-          <w:bCs w:val="false"/>
-          <w:i w:val="false"/>
-          <w:iCs w:val="false"/>
-          <w:u w:val="none"/>
-        </w:rPr>
-        <w:t>it is not our intent to</w:t>
-      </w:r>
-      <w:r>
-        <w:rPr>
-          <w:b w:val="false"/>
-          <w:bCs w:val="false"/>
-          <w:i w:val="false"/>
-          <w:iCs w:val="false"/>
-          <w:u w:val="none"/>
-        </w:rPr>
-        <w:t xml:space="preserve"> be accessing the variable being pointed to </w:t>
-      </w:r>
-      <w:r>
-        <w:rPr>
-          <w:b w:val="false"/>
-          <w:bCs w:val="false"/>
-          <w:i w:val="false"/>
-          <w:iCs w:val="false"/>
-          <w:u w:val="none"/>
-        </w:rPr>
-        <w:t>directly</w:t>
-      </w:r>
-      <w:r>
-        <w:rPr>
-          <w:b w:val="false"/>
-          <w:bCs w:val="false"/>
-          <w:i w:val="false"/>
-          <w:iCs w:val="false"/>
-          <w:u w:val="none"/>
-        </w:rPr>
-        <w:t xml:space="preserve">, </w:t>
-      </w:r>
-      <w:r>
-        <w:rPr>
-          <w:b w:val="false"/>
-          <w:bCs w:val="false"/>
-          <w:i w:val="false"/>
-          <w:iCs w:val="false"/>
-          <w:u w:val="none"/>
-        </w:rPr>
-        <w:t>but rather, only via the pointer that points to it</w:t>
-      </w:r>
-      <w:r>
-        <w:rPr>
-          <w:b w:val="false"/>
-          <w:bCs w:val="false"/>
-          <w:i w:val="false"/>
-          <w:iCs w:val="false"/>
-          <w:u w:val="none"/>
-        </w:rPr>
-        <w:t>. The compiler will then reduce certain optimization instructions to accomodate.</w:t>
+        <w:t>We haven’t discussed pointers yet, as I’ve already mentioned, but in short, a pointer is a variable that acts as a pipe towards another variable’s data. By accessing the pointer, we can access the variable that it points to. restrict is given to a pointer, and tells the compiler that that pointer is the only method of accessing the data of the variable that it’s pointing to. In other words, we use this if it is not our intent to be accessing the variable being pointed to directly, but rather, only via the pointer that points to it. The compiler will then reduce certain optimization instructions to accomodate.</w:t>
       </w:r>
     </w:p>
     <w:p>
@@ -12379,667 +10824,7 @@
           <w:u w:val="none"/>
         </w:rPr>
         <w:tab/>
-        <w:t xml:space="preserve">If it’s been a while since your </w:t>
-      </w:r>
-      <w:r>
-        <w:rPr>
-          <w:b w:val="false"/>
-          <w:bCs w:val="false"/>
-          <w:i w:val="false"/>
-          <w:iCs w:val="false"/>
-          <w:u w:val="none"/>
-        </w:rPr>
-        <w:t>O</w:t>
-      </w:r>
-      <w:r>
-        <w:rPr>
-          <w:b w:val="false"/>
-          <w:bCs w:val="false"/>
-          <w:i w:val="false"/>
-          <w:iCs w:val="false"/>
-          <w:u w:val="none"/>
-        </w:rPr>
-        <w:t xml:space="preserve">perating </w:t>
-      </w:r>
-      <w:r>
-        <w:rPr>
-          <w:b w:val="false"/>
-          <w:bCs w:val="false"/>
-          <w:i w:val="false"/>
-          <w:iCs w:val="false"/>
-          <w:u w:val="none"/>
-        </w:rPr>
-        <w:t>S</w:t>
-      </w:r>
-      <w:r>
-        <w:rPr>
-          <w:b w:val="false"/>
-          <w:bCs w:val="false"/>
-          <w:i w:val="false"/>
-          <w:iCs w:val="false"/>
-          <w:u w:val="none"/>
-        </w:rPr>
-        <w:t xml:space="preserve">ystems course, then allow this to be a bit of a refresher, as well as a potential area for learning new concepts. We will skip over </w:t>
-      </w:r>
-      <w:r>
-        <w:rPr>
-          <w:b w:val="false"/>
-          <w:bCs w:val="false"/>
-          <w:i w:val="false"/>
-          <w:iCs w:val="false"/>
-          <w:u w:val="none"/>
-        </w:rPr>
-        <w:t>microprocessors</w:t>
-      </w:r>
-      <w:r>
-        <w:rPr>
-          <w:b w:val="false"/>
-          <w:bCs w:val="false"/>
-          <w:i w:val="false"/>
-          <w:iCs w:val="false"/>
-          <w:u w:val="none"/>
-        </w:rPr>
-        <w:t xml:space="preserve"> and </w:t>
-      </w:r>
-      <w:r>
-        <w:rPr>
-          <w:b w:val="false"/>
-          <w:bCs w:val="false"/>
-          <w:i w:val="false"/>
-          <w:iCs w:val="false"/>
-          <w:u w:val="none"/>
-        </w:rPr>
-        <w:t>just focus our attention on</w:t>
-      </w:r>
-      <w:r>
-        <w:rPr>
-          <w:b w:val="false"/>
-          <w:bCs w:val="false"/>
-          <w:i w:val="false"/>
-          <w:iCs w:val="false"/>
-          <w:u w:val="none"/>
-        </w:rPr>
-        <w:t xml:space="preserve"> modern day processors. These days, nealy all CPUs have at least two physical cores. These physical cores are mirrors of each other – that is to say they are </w:t>
-      </w:r>
-      <w:r>
-        <w:rPr>
-          <w:b w:val="false"/>
-          <w:bCs w:val="false"/>
-          <w:i w:val="false"/>
-          <w:iCs w:val="false"/>
-          <w:u w:val="none"/>
-        </w:rPr>
-        <w:t>designed as twins (physically identical)</w:t>
-      </w:r>
-      <w:r>
-        <w:rPr>
-          <w:b w:val="false"/>
-          <w:bCs w:val="false"/>
-          <w:i w:val="false"/>
-          <w:iCs w:val="false"/>
-          <w:u w:val="none"/>
-        </w:rPr>
-        <w:t xml:space="preserve">. Each core contains a set of registers (32 registers is typical for modern day CPUs). </w:t>
-      </w:r>
-      <w:r>
-        <w:rPr>
-          <w:b w:val="false"/>
-          <w:bCs w:val="false"/>
-          <w:i w:val="false"/>
-          <w:iCs w:val="false"/>
-          <w:u w:val="none"/>
-        </w:rPr>
-        <w:t>If your confused about what a register is, it is really just a form of memory</w:t>
-      </w:r>
-      <w:r>
-        <w:rPr>
-          <w:b w:val="false"/>
-          <w:bCs w:val="false"/>
-          <w:i w:val="false"/>
-          <w:iCs w:val="false"/>
-          <w:u w:val="none"/>
-        </w:rPr>
-        <w:t xml:space="preserve">. In fact, any </w:t>
-      </w:r>
-      <w:r>
-        <w:rPr>
-          <w:b w:val="false"/>
-          <w:bCs w:val="false"/>
-          <w:i w:val="false"/>
-          <w:iCs w:val="false"/>
-          <w:u w:val="none"/>
-        </w:rPr>
-        <w:t>construct</w:t>
-      </w:r>
-      <w:r>
-        <w:rPr>
-          <w:b w:val="false"/>
-          <w:bCs w:val="false"/>
-          <w:i w:val="false"/>
-          <w:iCs w:val="false"/>
-          <w:u w:val="none"/>
-        </w:rPr>
-        <w:t xml:space="preserve"> </w:t>
-      </w:r>
-      <w:r>
-        <w:rPr>
-          <w:b w:val="false"/>
-          <w:bCs w:val="false"/>
-          <w:i w:val="false"/>
-          <w:iCs w:val="false"/>
-          <w:u w:val="none"/>
-        </w:rPr>
-        <w:t>capable</w:t>
-      </w:r>
-      <w:r>
-        <w:rPr>
-          <w:b w:val="false"/>
-          <w:bCs w:val="false"/>
-          <w:i w:val="false"/>
-          <w:iCs w:val="false"/>
-          <w:u w:val="none"/>
-        </w:rPr>
-        <w:t xml:space="preserve"> </w:t>
-      </w:r>
-      <w:r>
-        <w:rPr>
-          <w:b w:val="false"/>
-          <w:bCs w:val="false"/>
-          <w:i w:val="false"/>
-          <w:iCs w:val="false"/>
-          <w:u w:val="none"/>
-        </w:rPr>
-        <w:t xml:space="preserve">of </w:t>
-      </w:r>
-      <w:r>
-        <w:rPr>
-          <w:b w:val="false"/>
-          <w:bCs w:val="false"/>
-          <w:i w:val="false"/>
-          <w:iCs w:val="false"/>
-          <w:u w:val="none"/>
-        </w:rPr>
-        <w:t>stor</w:t>
-      </w:r>
-      <w:r>
-        <w:rPr>
-          <w:b w:val="false"/>
-          <w:bCs w:val="false"/>
-          <w:i w:val="false"/>
-          <w:iCs w:val="false"/>
-          <w:u w:val="none"/>
-        </w:rPr>
-        <w:t>ing</w:t>
-      </w:r>
-      <w:r>
-        <w:rPr>
-          <w:b w:val="false"/>
-          <w:bCs w:val="false"/>
-          <w:i w:val="false"/>
-          <w:iCs w:val="false"/>
-          <w:u w:val="none"/>
-        </w:rPr>
-        <w:t xml:space="preserve"> data </w:t>
-      </w:r>
-      <w:r>
-        <w:rPr>
-          <w:b w:val="false"/>
-          <w:bCs w:val="false"/>
-          <w:i w:val="false"/>
-          <w:iCs w:val="false"/>
-          <w:u w:val="none"/>
-        </w:rPr>
-        <w:t>can</w:t>
-      </w:r>
-      <w:r>
-        <w:rPr>
-          <w:b w:val="false"/>
-          <w:bCs w:val="false"/>
-          <w:i w:val="false"/>
-          <w:iCs w:val="false"/>
-          <w:u w:val="none"/>
-        </w:rPr>
-        <w:t xml:space="preserve"> technically </w:t>
-      </w:r>
-      <w:r>
-        <w:rPr>
-          <w:b w:val="false"/>
-          <w:bCs w:val="false"/>
-          <w:i w:val="false"/>
-          <w:iCs w:val="false"/>
-          <w:u w:val="none"/>
-        </w:rPr>
-        <w:t>be considered as</w:t>
-      </w:r>
-      <w:r>
-        <w:rPr>
-          <w:b w:val="false"/>
-          <w:bCs w:val="false"/>
-          <w:i w:val="false"/>
-          <w:iCs w:val="false"/>
-          <w:u w:val="none"/>
-        </w:rPr>
-        <w:t xml:space="preserve"> memory, </w:t>
-      </w:r>
-      <w:r>
-        <w:rPr>
-          <w:b w:val="false"/>
-          <w:bCs w:val="false"/>
-          <w:i w:val="false"/>
-          <w:iCs w:val="false"/>
-          <w:u w:val="none"/>
-        </w:rPr>
-        <w:t>which includes hard drives as well</w:t>
-      </w:r>
-      <w:r>
-        <w:rPr>
-          <w:b w:val="false"/>
-          <w:bCs w:val="false"/>
-          <w:i w:val="false"/>
-          <w:iCs w:val="false"/>
-          <w:u w:val="none"/>
-        </w:rPr>
-        <w:t xml:space="preserve">. Registers are designed to be very small ie. they cannot contain a lot of data, but the benefit is that they are extremely close to the </w:t>
-      </w:r>
-      <w:r>
-        <w:rPr>
-          <w:b w:val="false"/>
-          <w:bCs w:val="false"/>
-          <w:i w:val="false"/>
-          <w:iCs w:val="false"/>
-          <w:u w:val="none"/>
-        </w:rPr>
-        <w:t>A</w:t>
-      </w:r>
-      <w:r>
-        <w:rPr>
-          <w:b w:val="false"/>
-          <w:bCs w:val="false"/>
-          <w:i w:val="false"/>
-          <w:iCs w:val="false"/>
-          <w:u w:val="none"/>
-        </w:rPr>
-        <w:t xml:space="preserve">rithmetic </w:t>
-      </w:r>
-      <w:r>
-        <w:rPr>
-          <w:b w:val="false"/>
-          <w:bCs w:val="false"/>
-          <w:i w:val="false"/>
-          <w:iCs w:val="false"/>
-          <w:u w:val="none"/>
-        </w:rPr>
-        <w:t>L</w:t>
-      </w:r>
-      <w:r>
-        <w:rPr>
-          <w:b w:val="false"/>
-          <w:bCs w:val="false"/>
-          <w:i w:val="false"/>
-          <w:iCs w:val="false"/>
-          <w:u w:val="none"/>
-        </w:rPr>
-        <w:t xml:space="preserve">ogic </w:t>
-      </w:r>
-      <w:r>
-        <w:rPr>
-          <w:b w:val="false"/>
-          <w:bCs w:val="false"/>
-          <w:i w:val="false"/>
-          <w:iCs w:val="false"/>
-          <w:u w:val="none"/>
-        </w:rPr>
-        <w:t>U</w:t>
-      </w:r>
-      <w:r>
-        <w:rPr>
-          <w:b w:val="false"/>
-          <w:bCs w:val="false"/>
-          <w:i w:val="false"/>
-          <w:iCs w:val="false"/>
-          <w:u w:val="none"/>
-        </w:rPr>
-        <w:t xml:space="preserve">nit (ALU), </w:t>
-      </w:r>
-      <w:r>
-        <w:rPr>
-          <w:b w:val="false"/>
-          <w:bCs w:val="false"/>
-          <w:i w:val="false"/>
-          <w:iCs w:val="false"/>
-          <w:u w:val="none"/>
-        </w:rPr>
-        <w:t>Control Unit (CU), and Memory Unit (MU)</w:t>
-      </w:r>
-      <w:r>
-        <w:rPr>
-          <w:b w:val="false"/>
-          <w:bCs w:val="false"/>
-          <w:i w:val="false"/>
-          <w:iCs w:val="false"/>
-          <w:u w:val="none"/>
-        </w:rPr>
-        <w:t xml:space="preserve">. This means </w:t>
-      </w:r>
-      <w:r>
-        <w:rPr>
-          <w:b w:val="false"/>
-          <w:bCs w:val="false"/>
-          <w:i w:val="false"/>
-          <w:iCs w:val="false"/>
-          <w:u w:val="none"/>
-        </w:rPr>
-        <w:t>lighting fast calculations and read/write times</w:t>
-      </w:r>
-      <w:r>
-        <w:rPr>
-          <w:b w:val="false"/>
-          <w:bCs w:val="false"/>
-          <w:i w:val="false"/>
-          <w:iCs w:val="false"/>
-          <w:u w:val="none"/>
-        </w:rPr>
-        <w:t xml:space="preserve">. A bit further </w:t>
-      </w:r>
-      <w:r>
-        <w:rPr>
-          <w:b w:val="false"/>
-          <w:bCs w:val="false"/>
-          <w:i w:val="false"/>
-          <w:iCs w:val="false"/>
-          <w:u w:val="none"/>
-        </w:rPr>
-        <w:t xml:space="preserve">away (physically) </w:t>
-      </w:r>
-      <w:r>
-        <w:rPr>
-          <w:b w:val="false"/>
-          <w:bCs w:val="false"/>
-          <w:i w:val="false"/>
-          <w:iCs w:val="false"/>
-          <w:u w:val="none"/>
-        </w:rPr>
-        <w:t>from the registers, are the CPU’s cache</w:t>
-      </w:r>
-      <w:r>
-        <w:rPr>
-          <w:b w:val="false"/>
-          <w:bCs w:val="false"/>
-          <w:i w:val="false"/>
-          <w:iCs w:val="false"/>
-          <w:u w:val="none"/>
-        </w:rPr>
-        <w:t>s</w:t>
-      </w:r>
-      <w:r>
-        <w:rPr>
-          <w:b w:val="false"/>
-          <w:bCs w:val="false"/>
-          <w:i w:val="false"/>
-          <w:iCs w:val="false"/>
-          <w:u w:val="none"/>
-        </w:rPr>
-        <w:t xml:space="preserve">. </w:t>
-      </w:r>
-      <w:r>
-        <w:rPr>
-          <w:b w:val="false"/>
-          <w:bCs w:val="false"/>
-          <w:i w:val="false"/>
-          <w:iCs w:val="false"/>
-          <w:u w:val="none"/>
-        </w:rPr>
-        <w:t>A</w:t>
-      </w:r>
-      <w:r>
-        <w:rPr>
-          <w:b w:val="false"/>
-          <w:bCs w:val="false"/>
-          <w:i w:val="false"/>
-          <w:iCs w:val="false"/>
-          <w:u w:val="none"/>
-        </w:rPr>
-        <w:t xml:space="preserve"> cache is </w:t>
-      </w:r>
-      <w:r>
-        <w:rPr>
-          <w:b w:val="false"/>
-          <w:bCs w:val="false"/>
-          <w:i w:val="false"/>
-          <w:iCs w:val="false"/>
-          <w:u w:val="none"/>
-        </w:rPr>
-        <w:t>also just</w:t>
-      </w:r>
-      <w:r>
-        <w:rPr>
-          <w:b w:val="false"/>
-          <w:bCs w:val="false"/>
-          <w:i w:val="false"/>
-          <w:iCs w:val="false"/>
-          <w:u w:val="none"/>
-        </w:rPr>
-        <w:t xml:space="preserve"> memory. In modern processors, there are typically 3 levels of cache: L1, L2, and L3. Usually, L3 is shared between 2 cores, but </w:t>
-      </w:r>
-      <w:r>
-        <w:rPr>
-          <w:b w:val="false"/>
-          <w:bCs w:val="false"/>
-          <w:i w:val="false"/>
-          <w:iCs w:val="false"/>
-          <w:u w:val="none"/>
-        </w:rPr>
-        <w:t>the architecture really depends on your CPU</w:t>
-      </w:r>
-      <w:r>
-        <w:rPr>
-          <w:b w:val="false"/>
-          <w:bCs w:val="false"/>
-          <w:i w:val="false"/>
-          <w:iCs w:val="false"/>
-          <w:u w:val="none"/>
-        </w:rPr>
-        <w:t xml:space="preserve">. </w:t>
-      </w:r>
-      <w:r>
-        <w:rPr>
-          <w:b w:val="false"/>
-          <w:bCs w:val="false"/>
-          <w:i w:val="false"/>
-          <w:iCs w:val="false"/>
-          <w:u w:val="none"/>
-        </w:rPr>
-        <w:t>Caches</w:t>
-      </w:r>
-      <w:r>
-        <w:rPr>
-          <w:b w:val="false"/>
-          <w:bCs w:val="false"/>
-          <w:i w:val="false"/>
-          <w:iCs w:val="false"/>
-          <w:u w:val="none"/>
-        </w:rPr>
-        <w:t xml:space="preserve"> are also designed to be small, and they actually </w:t>
-      </w:r>
-      <w:r>
-        <w:rPr>
-          <w:b w:val="false"/>
-          <w:bCs w:val="false"/>
-          <w:i w:val="false"/>
-          <w:iCs w:val="false"/>
-          <w:u w:val="none"/>
-        </w:rPr>
-        <w:t>become</w:t>
-      </w:r>
-      <w:r>
-        <w:rPr>
-          <w:b w:val="false"/>
-          <w:bCs w:val="false"/>
-          <w:i w:val="false"/>
-          <w:iCs w:val="false"/>
-          <w:u w:val="none"/>
-        </w:rPr>
-        <w:t xml:space="preserve"> </w:t>
-      </w:r>
-      <w:r>
-        <w:rPr>
-          <w:b w:val="false"/>
-          <w:bCs w:val="false"/>
-          <w:i w:val="false"/>
-          <w:iCs w:val="false"/>
-          <w:u w:val="none"/>
-        </w:rPr>
-        <w:t>larger in</w:t>
-      </w:r>
-      <w:r>
-        <w:rPr>
-          <w:b w:val="false"/>
-          <w:bCs w:val="false"/>
-          <w:i w:val="false"/>
-          <w:iCs w:val="false"/>
-          <w:u w:val="none"/>
-        </w:rPr>
-        <w:t xml:space="preserve"> </w:t>
-      </w:r>
-      <w:r>
-        <w:rPr>
-          <w:b w:val="false"/>
-          <w:bCs w:val="false"/>
-          <w:i w:val="false"/>
-          <w:iCs w:val="false"/>
-          <w:u w:val="none"/>
-        </w:rPr>
-        <w:t xml:space="preserve">terms of storage </w:t>
-      </w:r>
-      <w:r>
-        <w:rPr>
-          <w:b w:val="false"/>
-          <w:bCs w:val="false"/>
-          <w:i w:val="false"/>
-          <w:iCs w:val="false"/>
-          <w:u w:val="none"/>
-        </w:rPr>
-        <w:t xml:space="preserve">size as you get further </w:t>
-      </w:r>
-      <w:r>
-        <w:rPr>
-          <w:b w:val="false"/>
-          <w:bCs w:val="false"/>
-          <w:i w:val="false"/>
-          <w:iCs w:val="false"/>
-          <w:u w:val="none"/>
-        </w:rPr>
-        <w:t xml:space="preserve">(physically) </w:t>
-      </w:r>
-      <w:r>
-        <w:rPr>
-          <w:b w:val="false"/>
-          <w:bCs w:val="false"/>
-          <w:i w:val="false"/>
-          <w:iCs w:val="false"/>
-          <w:u w:val="none"/>
-        </w:rPr>
-        <w:t xml:space="preserve">from the ALU. L1 is the smallest, then L2, then L3. The CPU will often place the most recently used data in L1 cache. Data which is less frequently used </w:t>
-      </w:r>
-      <w:r>
-        <w:rPr>
-          <w:b w:val="false"/>
-          <w:bCs w:val="false"/>
-          <w:i w:val="false"/>
-          <w:iCs w:val="false"/>
-          <w:u w:val="none"/>
-        </w:rPr>
-        <w:t>will be</w:t>
-      </w:r>
-      <w:r>
-        <w:rPr>
-          <w:b w:val="false"/>
-          <w:bCs w:val="false"/>
-          <w:i w:val="false"/>
-          <w:iCs w:val="false"/>
-          <w:u w:val="none"/>
-        </w:rPr>
-        <w:t xml:space="preserve"> </w:t>
-      </w:r>
-      <w:r>
-        <w:rPr>
-          <w:b w:val="false"/>
-          <w:bCs w:val="false"/>
-          <w:i w:val="false"/>
-          <w:iCs w:val="false"/>
-          <w:u w:val="none"/>
-        </w:rPr>
-        <w:t xml:space="preserve">demoted to </w:t>
-      </w:r>
-      <w:r>
-        <w:rPr>
-          <w:b w:val="false"/>
-          <w:bCs w:val="false"/>
-          <w:i w:val="false"/>
-          <w:iCs w:val="false"/>
-          <w:u w:val="none"/>
-        </w:rPr>
-        <w:t xml:space="preserve">lower and lower </w:t>
-      </w:r>
-      <w:r>
-        <w:rPr>
-          <w:b w:val="false"/>
-          <w:bCs w:val="false"/>
-          <w:i w:val="false"/>
-          <w:iCs w:val="false"/>
-          <w:u w:val="none"/>
-        </w:rPr>
-        <w:t>cache levels in order to leave room in the higher access speed caches for variables that are more frequently accessed</w:t>
-      </w:r>
-      <w:r>
-        <w:rPr>
-          <w:b w:val="false"/>
-          <w:bCs w:val="false"/>
-          <w:i w:val="false"/>
-          <w:iCs w:val="false"/>
-          <w:u w:val="none"/>
-        </w:rPr>
-        <w:t>. When the CPU searches an entire cache and does not find the data that it is looking for, we call this a “cache miss”. The L1, L2, and L3 caches are further broken down into se</w:t>
-      </w:r>
-      <w:r>
-        <w:rPr>
-          <w:b w:val="false"/>
-          <w:bCs w:val="false"/>
-          <w:i w:val="false"/>
-          <w:iCs w:val="false"/>
-          <w:u w:val="none"/>
-        </w:rPr>
-        <w:t>ctors</w:t>
-      </w:r>
-      <w:r>
-        <w:rPr>
-          <w:b w:val="false"/>
-          <w:bCs w:val="false"/>
-          <w:i w:val="false"/>
-          <w:iCs w:val="false"/>
-          <w:u w:val="none"/>
-        </w:rPr>
-        <w:t xml:space="preserve"> called cache lines, which are the smallest </w:t>
-      </w:r>
-      <w:r>
-        <w:rPr>
-          <w:b w:val="false"/>
-          <w:bCs w:val="false"/>
-          <w:i w:val="false"/>
-          <w:iCs w:val="false"/>
-          <w:u w:val="none"/>
-        </w:rPr>
-        <w:t>segment</w:t>
-      </w:r>
-      <w:r>
-        <w:rPr>
-          <w:b w:val="false"/>
-          <w:bCs w:val="false"/>
-          <w:i w:val="false"/>
-          <w:iCs w:val="false"/>
-          <w:u w:val="none"/>
-        </w:rPr>
-        <w:t xml:space="preserve"> of data that can be mapped into a cache. Note that registers and caches are both local to the CPU, but main memory is not.</w:t>
+        <w:t>If it’s been a while since your Operating Systems course, then allow this to be a bit of a refresher, as well as a potential area for learning new concepts. We will skip over microprocessors and just focus our attention on modern day processors. These days, nealy all CPUs have at least two physical cores. These physical cores are mirrors of each other – that is to say they are designed as twins (physically identical). Each core contains a set of registers (32 registers is typical for modern day CPUs). If your confused about what a register is, it is really just a form of memory. In fact, any construct capable of storing data can technically be considered as memory, which includes hard drives as well. Registers are designed to be very small ie. they cannot contain a lot of data, but the benefit is that they are extremely close to the Arithmetic Logic Unit (ALU), Control Unit (CU), and Memory Unit (MU). This means lighting fast calculations and read/write times. A bit further away (physically) from the registers, are the CPU’s caches. A cache is also just memory. In modern processors, there are typically 3 levels of cache: L1, L2, and L3. Usually, L3 is shared between 2 cores, but the architecture really depends on your CPU. Caches are also designed to be small, and they actually become larger in terms of storage size as you get further (physically) from the ALU. L1 is the smallest, then L2, then L3. The CPU will often place the most recently used data in L1 cache. Data which is less frequently used will be demoted to lower and lower cache levels in order to leave room in the higher access speed caches for variables that are more frequently accessed. When the CPU searches an entire cache and does not find the data that it is looking for, we call this a “cache miss”. The L1, L2, and L3 caches are further broken down into sectors called cache lines, which are the smallest segment of data that can be mapped into a cache. Note that registers and caches are both local to the CPU, but main memory is not.</w:t>
       </w:r>
     </w:p>
     <w:p>
@@ -13109,427 +10894,7 @@
           <w:u w:val="none"/>
         </w:rPr>
         <w:tab/>
-        <w:t xml:space="preserve">The Memory Management Unit (MMU) is sort of like a security bot that patrols our PC’s data transactions and tries to prevent accidental, or even mallicious, memory manipulation. Contrary to popular belief, the MMU </w:t>
-      </w:r>
-      <w:r>
-        <w:rPr>
-          <w:b w:val="false"/>
-          <w:bCs w:val="false"/>
-          <w:i w:val="false"/>
-          <w:iCs w:val="false"/>
-          <w:u w:val="none"/>
-        </w:rPr>
-        <w:t>does not exclusively work for the</w:t>
-      </w:r>
-      <w:r>
-        <w:rPr>
-          <w:b w:val="false"/>
-          <w:bCs w:val="false"/>
-          <w:i w:val="false"/>
-          <w:iCs w:val="false"/>
-          <w:u w:val="none"/>
-        </w:rPr>
-        <w:t xml:space="preserve"> CPU. Modern day CPUs will almost certainly have MMUs built in to them, but </w:t>
-      </w:r>
-      <w:r>
-        <w:rPr>
-          <w:b w:val="false"/>
-          <w:bCs w:val="false"/>
-          <w:i w:val="false"/>
-          <w:iCs w:val="false"/>
-          <w:u w:val="none"/>
-        </w:rPr>
-        <w:t xml:space="preserve">so do </w:t>
-      </w:r>
-      <w:r>
-        <w:rPr>
-          <w:b w:val="false"/>
-          <w:bCs w:val="false"/>
-          <w:i w:val="false"/>
-          <w:iCs w:val="false"/>
-          <w:u w:val="none"/>
-        </w:rPr>
-        <w:t xml:space="preserve">most peripherals. Now, you may have heard of virtual memory vs physical memory. Technically speaking, the correct term for </w:t>
-      </w:r>
-      <w:r>
-        <w:rPr>
-          <w:b w:val="false"/>
-          <w:bCs w:val="false"/>
-          <w:i w:val="false"/>
-          <w:iCs w:val="false"/>
-          <w:u w:val="none"/>
-        </w:rPr>
-        <w:t>virtual memory</w:t>
-      </w:r>
-      <w:r>
-        <w:rPr>
-          <w:b w:val="false"/>
-          <w:bCs w:val="false"/>
-          <w:i w:val="false"/>
-          <w:iCs w:val="false"/>
-          <w:u w:val="none"/>
-        </w:rPr>
-        <w:t xml:space="preserve"> is Virtual Address Space (VAS) and </w:t>
-      </w:r>
-      <w:r>
-        <w:rPr>
-          <w:b w:val="false"/>
-          <w:bCs w:val="false"/>
-          <w:i w:val="false"/>
-          <w:iCs w:val="false"/>
-          <w:u w:val="none"/>
-        </w:rPr>
-        <w:t>the correct term for physical memory is</w:t>
-      </w:r>
-      <w:r>
-        <w:rPr>
-          <w:b w:val="false"/>
-          <w:bCs w:val="false"/>
-          <w:i w:val="false"/>
-          <w:iCs w:val="false"/>
-          <w:u w:val="none"/>
-        </w:rPr>
-        <w:t xml:space="preserve"> Physical Address Space (PAS). </w:t>
-      </w:r>
-      <w:r>
-        <w:rPr>
-          <w:b w:val="false"/>
-          <w:bCs w:val="false"/>
-          <w:i w:val="false"/>
-          <w:iCs w:val="false"/>
-          <w:u w:val="none"/>
-        </w:rPr>
-        <w:t>B</w:t>
-      </w:r>
-      <w:r>
-        <w:rPr>
-          <w:b w:val="false"/>
-          <w:bCs w:val="false"/>
-          <w:i w:val="false"/>
-          <w:iCs w:val="false"/>
-          <w:u w:val="none"/>
-        </w:rPr>
-        <w:t>efore MMU</w:t>
-      </w:r>
-      <w:r>
-        <w:rPr>
-          <w:b w:val="false"/>
-          <w:bCs w:val="false"/>
-          <w:i w:val="false"/>
-          <w:iCs w:val="false"/>
-          <w:u w:val="none"/>
-        </w:rPr>
-        <w:t>s existed</w:t>
-      </w:r>
-      <w:r>
-        <w:rPr>
-          <w:b w:val="false"/>
-          <w:bCs w:val="false"/>
-          <w:i w:val="false"/>
-          <w:iCs w:val="false"/>
-          <w:u w:val="none"/>
-        </w:rPr>
-        <w:t xml:space="preserve">, we only had PAS. This led to </w:t>
-      </w:r>
-      <w:r>
-        <w:rPr>
-          <w:b w:val="false"/>
-          <w:bCs w:val="false"/>
-          <w:i w:val="false"/>
-          <w:iCs w:val="false"/>
-          <w:u w:val="none"/>
-        </w:rPr>
-        <w:t>numerous</w:t>
-      </w:r>
-      <w:r>
-        <w:rPr>
-          <w:b w:val="false"/>
-          <w:bCs w:val="false"/>
-          <w:i w:val="false"/>
-          <w:iCs w:val="false"/>
-          <w:u w:val="none"/>
-        </w:rPr>
-        <w:t xml:space="preserve"> issues. V</w:t>
-      </w:r>
-      <w:r>
-        <w:rPr>
-          <w:b w:val="false"/>
-          <w:bCs w:val="false"/>
-          <w:i w:val="false"/>
-          <w:iCs w:val="false"/>
-          <w:u w:val="none"/>
-        </w:rPr>
-        <w:t>AS, on the other hand,</w:t>
-      </w:r>
-      <w:r>
-        <w:rPr>
-          <w:b w:val="false"/>
-          <w:bCs w:val="false"/>
-          <w:i w:val="false"/>
-          <w:iCs w:val="false"/>
-          <w:u w:val="none"/>
-        </w:rPr>
-        <w:t xml:space="preserve"> is purely conceptual – it does not reside anywhere physically. The MMU makes up </w:t>
-      </w:r>
-      <w:r>
-        <w:rPr>
-          <w:b w:val="false"/>
-          <w:bCs w:val="false"/>
-          <w:i w:val="false"/>
-          <w:iCs w:val="false"/>
-          <w:u w:val="none"/>
-        </w:rPr>
-        <w:t xml:space="preserve">an </w:t>
-      </w:r>
-      <w:r>
-        <w:rPr>
-          <w:b w:val="false"/>
-          <w:bCs w:val="false"/>
-          <w:i w:val="false"/>
-          <w:iCs w:val="false"/>
-          <w:u w:val="none"/>
-        </w:rPr>
-        <w:t>address space, lets say 0x00000000 to 0xFFFFFFFF, which will be our VAS. It then map</w:t>
-      </w:r>
-      <w:r>
-        <w:rPr>
-          <w:b w:val="false"/>
-          <w:bCs w:val="false"/>
-          <w:i w:val="false"/>
-          <w:iCs w:val="false"/>
-          <w:u w:val="none"/>
-        </w:rPr>
-        <w:t>s</w:t>
-      </w:r>
-      <w:r>
-        <w:rPr>
-          <w:b w:val="false"/>
-          <w:bCs w:val="false"/>
-          <w:i w:val="false"/>
-          <w:iCs w:val="false"/>
-          <w:u w:val="none"/>
-        </w:rPr>
-        <w:t xml:space="preserve"> “pages” of PAS to VAS. PAS and VAS are segmented into sectors that are 4096 bytes in size (4KB) called pages. Each page has a base address which will be the first address of th</w:t>
-      </w:r>
-      <w:r>
-        <w:rPr>
-          <w:b w:val="false"/>
-          <w:bCs w:val="false"/>
-          <w:i w:val="false"/>
-          <w:iCs w:val="false"/>
-          <w:u w:val="none"/>
-        </w:rPr>
-        <w:t>at respective</w:t>
-      </w:r>
-      <w:r>
-        <w:rPr>
-          <w:b w:val="false"/>
-          <w:bCs w:val="false"/>
-          <w:i w:val="false"/>
-          <w:iCs w:val="false"/>
-          <w:u w:val="none"/>
-        </w:rPr>
-        <w:t xml:space="preserve"> page. The MMUs job is t</w:t>
-      </w:r>
-      <w:r>
-        <w:rPr>
-          <w:b w:val="false"/>
-          <w:bCs w:val="false"/>
-          <w:i w:val="false"/>
-          <w:iCs w:val="false"/>
-          <w:u w:val="none"/>
-        </w:rPr>
-        <w:t>o map physical pages in PAS</w:t>
-      </w:r>
-      <w:r>
-        <w:rPr>
-          <w:b w:val="false"/>
-          <w:bCs w:val="false"/>
-          <w:i w:val="false"/>
-          <w:iCs w:val="false"/>
-          <w:u w:val="none"/>
-        </w:rPr>
-        <w:t xml:space="preserve"> and map </w:t>
-      </w:r>
-      <w:r>
-        <w:rPr>
-          <w:b w:val="false"/>
-          <w:bCs w:val="false"/>
-          <w:i w:val="false"/>
-          <w:iCs w:val="false"/>
-          <w:u w:val="none"/>
-        </w:rPr>
-        <w:t>them</w:t>
-      </w:r>
-      <w:r>
-        <w:rPr>
-          <w:b w:val="false"/>
-          <w:bCs w:val="false"/>
-          <w:i w:val="false"/>
-          <w:iCs w:val="false"/>
-          <w:u w:val="none"/>
-        </w:rPr>
-        <w:t xml:space="preserve"> to </w:t>
-      </w:r>
-      <w:r>
-        <w:rPr>
-          <w:b w:val="false"/>
-          <w:bCs w:val="false"/>
-          <w:i w:val="false"/>
-          <w:iCs w:val="false"/>
-          <w:u w:val="none"/>
-        </w:rPr>
-        <w:t xml:space="preserve">virtual </w:t>
-      </w:r>
-      <w:r>
-        <w:rPr>
-          <w:b w:val="false"/>
-          <w:bCs w:val="false"/>
-          <w:i w:val="false"/>
-          <w:iCs w:val="false"/>
-          <w:u w:val="none"/>
-        </w:rPr>
-        <w:t>page</w:t>
-      </w:r>
-      <w:r>
-        <w:rPr>
-          <w:b w:val="false"/>
-          <w:bCs w:val="false"/>
-          <w:i w:val="false"/>
-          <w:iCs w:val="false"/>
-          <w:u w:val="none"/>
-        </w:rPr>
-        <w:t>s</w:t>
-      </w:r>
-      <w:r>
-        <w:rPr>
-          <w:b w:val="false"/>
-          <w:bCs w:val="false"/>
-          <w:i w:val="false"/>
-          <w:iCs w:val="false"/>
-          <w:u w:val="none"/>
-        </w:rPr>
-        <w:t xml:space="preserve"> in VAS. This is useful for a few reasons. The first reason is </w:t>
-      </w:r>
-      <w:r>
-        <w:rPr>
-          <w:b w:val="false"/>
-          <w:bCs w:val="false"/>
-          <w:i w:val="false"/>
-          <w:iCs w:val="false"/>
-          <w:u w:val="none"/>
-        </w:rPr>
-        <w:t>that</w:t>
-      </w:r>
-      <w:r>
-        <w:rPr>
-          <w:b w:val="false"/>
-          <w:bCs w:val="false"/>
-          <w:i w:val="false"/>
-          <w:iCs w:val="false"/>
-          <w:u w:val="none"/>
-        </w:rPr>
-        <w:t xml:space="preserve"> it is much easier for us to get contiguous memory in VAS. You see, back in the days where VAS did not exist, memory was “static”. We had to pre-</w:t>
-      </w:r>
-      <w:r>
-        <w:rPr>
-          <w:b w:val="false"/>
-          <w:bCs w:val="false"/>
-          <w:i w:val="false"/>
-          <w:iCs w:val="false"/>
-          <w:u w:val="none"/>
-        </w:rPr>
-        <w:t xml:space="preserve">allocate certain </w:t>
-      </w:r>
-      <w:r>
-        <w:rPr>
-          <w:b w:val="false"/>
-          <w:bCs w:val="false"/>
-          <w:i w:val="false"/>
-          <w:iCs w:val="false"/>
-          <w:u w:val="none"/>
-        </w:rPr>
-        <w:t>location</w:t>
-      </w:r>
-      <w:r>
-        <w:rPr>
-          <w:b w:val="false"/>
-          <w:bCs w:val="false"/>
-          <w:i w:val="false"/>
-          <w:iCs w:val="false"/>
-          <w:u w:val="none"/>
-        </w:rPr>
-        <w:t>s</w:t>
-      </w:r>
-      <w:r>
-        <w:rPr>
-          <w:b w:val="false"/>
-          <w:bCs w:val="false"/>
-          <w:i w:val="false"/>
-          <w:iCs w:val="false"/>
-          <w:u w:val="none"/>
-        </w:rPr>
-        <w:t xml:space="preserve"> </w:t>
-      </w:r>
-      <w:r>
-        <w:rPr>
-          <w:b w:val="false"/>
-          <w:bCs w:val="false"/>
-          <w:i w:val="false"/>
-          <w:iCs w:val="false"/>
-          <w:u w:val="none"/>
-        </w:rPr>
-        <w:t>in memory</w:t>
-      </w:r>
-      <w:r>
-        <w:rPr>
-          <w:b w:val="false"/>
-          <w:bCs w:val="false"/>
-          <w:i w:val="false"/>
-          <w:iCs w:val="false"/>
-          <w:u w:val="none"/>
-        </w:rPr>
-        <w:t xml:space="preserve"> for our program, variables, and I/O. This led to easy attacks because hackers would be able to know exactly where everything started and ended, and could write or read from the correct locations to perform mallicious attacks. The primary solution to this is called Address Space Layout Randomization (ASLR). ASLR scrambles PAS randomly, so that the pages are all scattered, and writing or reading from somewhere is more likely to result in a crash. The downside to ASLR is that PAS is no longer had contiguous memory, which is desirable for pointer arithmetic and access times. For example, imagine an array of data, but each </w:t>
-      </w:r>
-      <w:r>
-        <w:rPr>
-          <w:b w:val="false"/>
-          <w:bCs w:val="false"/>
-          <w:i w:val="false"/>
-          <w:iCs w:val="false"/>
-          <w:u w:val="none"/>
-        </w:rPr>
-        <w:t>element</w:t>
-      </w:r>
-      <w:r>
-        <w:rPr>
-          <w:b w:val="false"/>
-          <w:bCs w:val="false"/>
-          <w:i w:val="false"/>
-          <w:iCs w:val="false"/>
-          <w:u w:val="none"/>
-        </w:rPr>
-        <w:t xml:space="preserve"> </w:t>
-      </w:r>
-      <w:r>
-        <w:rPr>
-          <w:b w:val="false"/>
-          <w:bCs w:val="false"/>
-          <w:i w:val="false"/>
-          <w:iCs w:val="false"/>
-          <w:u w:val="none"/>
-        </w:rPr>
-        <w:t>of</w:t>
-      </w:r>
-      <w:r>
-        <w:rPr>
-          <w:b w:val="false"/>
-          <w:bCs w:val="false"/>
-          <w:i w:val="false"/>
-          <w:iCs w:val="false"/>
-          <w:u w:val="none"/>
-        </w:rPr>
-        <w:t xml:space="preserve"> the array resides in a different location in RAM. The access times would be abysmal because the CPU would have to fetch the data from all over the place. With VAS, we can map all these segmented pages from PAS into one contiguous virtual memory location, meaning that each item in the array can be accessed one after the other (in other words, the MMU has already done the mapping, so it already knows where to look in PAS). </w:t>
+        <w:t xml:space="preserve">The Memory Management Unit (MMU) is sort of like a security bot that patrols our PC’s data transactions and tries to prevent accidental, or even mallicious, memory manipulation. Contrary to popular belief, the MMU does not exclusively work for the CPU. Modern day CPUs will almost certainly have MMUs built in to them, but so do most peripherals. Now, you may have heard of virtual memory vs physical memory. Technically speaking, the correct term for virtual memory is Virtual Address Space (VAS) and the correct term for physical memory is Physical Address Space (PAS). Before MMUs existed, we only had PAS. This led to numerous issues. VAS, on the other hand, is purely conceptual – it does not reside anywhere physically. The MMU makes up an address space, lets say 0x00000000 to 0xFFFFFFFF, which will be our VAS. It then maps “pages” of PAS to VAS. PAS and VAS are segmented into sectors that are 4096 bytes in size (4KB) called pages. Each page has a base address which will be the first address of that respective page. The MMUs job is to map physical pages in PAS and map them to virtual pages in VAS. This is useful for a few reasons. The first reason is that it is much easier for us to get contiguous memory in VAS. You see, back in the days where VAS did not exist, memory was “static”. We had to pre-allocate certain locations in memory for our program, variables, and I/O. This led to easy attacks because hackers would be able to know exactly where everything started and ended, and could write or read from the correct locations to perform mallicious attacks. The primary solution to this is called Address Space Layout Randomization (ASLR). ASLR scrambles PAS randomly, so that the pages are all scattered, and writing or reading from somewhere is more likely to result in a crash. The downside to ASLR is that PAS is no longer had contiguous memory, which is desirable for pointer arithmetic and access times. For example, imagine an array of data, but each element of the array resides in a different location in RAM. The access times would be abysmal because the CPU would have to fetch the data from all over the place. With VAS, we can map all these segmented pages from PAS into one contiguous virtual memory location, meaning that each item in the array can be accessed one after the other (in other words, the MMU has already done the mapping, so it already knows where to look in PAS). </w:t>
       </w:r>
     </w:p>
     <w:p>
@@ -13577,211 +10942,7 @@
           <w:u w:val="none"/>
         </w:rPr>
         <w:tab/>
-        <w:t xml:space="preserve">You’ve likely heard of something called the stack, or stack space. Certain embedded systems might not implement stacks at all, </w:t>
-      </w:r>
-      <w:r>
-        <w:rPr>
-          <w:u w:val="none"/>
-        </w:rPr>
-        <w:t>and program stacks are not even mentioned within the C specification</w:t>
-      </w:r>
-      <w:r>
-        <w:rPr>
-          <w:u w:val="none"/>
-        </w:rPr>
-        <w:t xml:space="preserve">, but in most modern systems, it is </w:t>
-      </w:r>
-      <w:r>
-        <w:rPr>
-          <w:u w:val="none"/>
-        </w:rPr>
-        <w:t>probably</w:t>
-      </w:r>
-      <w:r>
-        <w:rPr>
-          <w:u w:val="none"/>
-        </w:rPr>
-        <w:t xml:space="preserve"> safe to assume that each program executes within its own unique program stack. The MMU is in charge of figuring out approximately how much space the program will require, and then </w:t>
-      </w:r>
-      <w:r>
-        <w:rPr>
-          <w:u w:val="none"/>
-        </w:rPr>
-        <w:t xml:space="preserve">reserving space for it by </w:t>
-      </w:r>
-      <w:r>
-        <w:rPr>
-          <w:u w:val="none"/>
-        </w:rPr>
-        <w:t xml:space="preserve">mapping PAS to VAS. Stacks can be quite large depending on the program. The benefit of stacks is that they isolate a program to a </w:t>
-      </w:r>
-      <w:r>
-        <w:rPr>
-          <w:u w:val="none"/>
-        </w:rPr>
-        <w:t>specific</w:t>
-      </w:r>
-      <w:r>
-        <w:rPr>
-          <w:u w:val="none"/>
-        </w:rPr>
-        <w:t xml:space="preserve"> address space. If the program attempts to read or write from a location outside of th</w:t>
-      </w:r>
-      <w:r>
-        <w:rPr>
-          <w:u w:val="none"/>
-        </w:rPr>
-        <w:t>is</w:t>
-      </w:r>
-      <w:r>
-        <w:rPr>
-          <w:u w:val="none"/>
-        </w:rPr>
-        <w:t xml:space="preserve"> stack space, the MMU will throw an error and terminate the program. This </w:t>
-      </w:r>
-      <w:r>
-        <w:rPr>
-          <w:u w:val="none"/>
-        </w:rPr>
-        <w:t>doubles</w:t>
-      </w:r>
-      <w:r>
-        <w:rPr>
-          <w:u w:val="none"/>
-        </w:rPr>
-        <w:t xml:space="preserve"> a security feature. The stack is further segmented into parts called stack frames. Stack frames often represent a single function </w:t>
-      </w:r>
-      <w:r>
-        <w:rPr>
-          <w:u w:val="none"/>
-        </w:rPr>
-        <w:t xml:space="preserve">or sub-routine </w:t>
-      </w:r>
-      <w:r>
-        <w:rPr>
-          <w:u w:val="none"/>
-        </w:rPr>
-        <w:t xml:space="preserve">of the program. When a function call is made, a new stack frame is created, and we push </w:t>
-      </w:r>
-      <w:r>
-        <w:rPr>
-          <w:u w:val="none"/>
-        </w:rPr>
-        <w:t xml:space="preserve">the appropriate </w:t>
-      </w:r>
-      <w:r>
-        <w:rPr>
-          <w:u w:val="none"/>
-        </w:rPr>
-        <w:t>data onto th</w:t>
-      </w:r>
-      <w:r>
-        <w:rPr>
-          <w:u w:val="none"/>
-        </w:rPr>
-        <w:t>at</w:t>
-      </w:r>
-      <w:r>
-        <w:rPr>
-          <w:u w:val="none"/>
-        </w:rPr>
-        <w:t xml:space="preserve"> frame. The sorts of data include other function calls, saved registers, local variables, </w:t>
-      </w:r>
-      <w:r>
-        <w:rPr>
-          <w:u w:val="none"/>
-        </w:rPr>
-        <w:t xml:space="preserve">the </w:t>
-      </w:r>
-      <w:r>
-        <w:rPr>
-          <w:u w:val="none"/>
-        </w:rPr>
-        <w:t xml:space="preserve">frame pointer of the function being called, and arguments to the function. If you recall going over storage duration, </w:t>
-      </w:r>
-      <w:r>
-        <w:rPr>
-          <w:u w:val="none"/>
-        </w:rPr>
-        <w:t>you’ll hopefully remember that automatic variables are stored for the duration of their enclosing scope, which really comes down to the stack frame they belong to</w:t>
-      </w:r>
-      <w:r>
-        <w:rPr>
-          <w:u w:val="none"/>
-        </w:rPr>
-        <w:t xml:space="preserve">. Once the function ends, the stack frame is popped off of the stack, </w:t>
-      </w:r>
-      <w:r>
-        <w:rPr>
-          <w:u w:val="none"/>
-        </w:rPr>
-        <w:t>effectively making that memory available once more</w:t>
-      </w:r>
-      <w:r>
-        <w:rPr>
-          <w:u w:val="none"/>
-        </w:rPr>
-        <w:t xml:space="preserve">. Because stack frames are local to the program stack, data </w:t>
-      </w:r>
-      <w:r>
-        <w:rPr>
-          <w:u w:val="none"/>
-        </w:rPr>
-        <w:t>can be</w:t>
-      </w:r>
-      <w:r>
-        <w:rPr>
-          <w:u w:val="none"/>
-        </w:rPr>
-        <w:t xml:space="preserve"> accessed </w:t>
-      </w:r>
-      <w:r>
-        <w:rPr>
-          <w:u w:val="none"/>
-        </w:rPr>
-        <w:t>quickly between frames</w:t>
-      </w:r>
-      <w:r>
-        <w:rPr>
-          <w:u w:val="none"/>
-        </w:rPr>
-        <w:t xml:space="preserve">. </w:t>
-      </w:r>
-      <w:r>
-        <w:rPr>
-          <w:u w:val="none"/>
-        </w:rPr>
-        <w:t>T</w:t>
-      </w:r>
-      <w:r>
-        <w:rPr>
-          <w:u w:val="none"/>
-        </w:rPr>
-        <w:t xml:space="preserve">he downside to stack frames is that they are volatile, </w:t>
-      </w:r>
-      <w:r>
-        <w:rPr>
-          <w:u w:val="none"/>
-        </w:rPr>
-        <w:t xml:space="preserve">since they are popped off ie. destroyed. </w:t>
-      </w:r>
-      <w:r>
-        <w:rPr>
-          <w:u w:val="none"/>
-        </w:rPr>
-        <w:t>Th</w:t>
-      </w:r>
-      <w:r>
-        <w:rPr>
-          <w:u w:val="none"/>
-        </w:rPr>
-        <w:t>is</w:t>
-      </w:r>
-      <w:r>
-        <w:rPr>
-          <w:u w:val="none"/>
-        </w:rPr>
-        <w:t xml:space="preserve"> leads us to heap space.</w:t>
+        <w:t>You’ve likely heard of something called the stack, or stack space. Certain embedded systems might not implement stacks at all, and program stacks are not even mentioned within the C specification, but in most modern systems, it is probably safe to assume that each program executes within its own unique program stack. The MMU is in charge of figuring out approximately how much space the program will require, and then reserving space for it by mapping PAS to VAS. Stacks can be quite large depending on the program. The benefit of stacks is that they isolate a program to a specific address space. If the program attempts to read or write from a location outside of this stack space, the MMU will throw an error and terminate the program. This doubles a security feature. The stack is further segmented into parts called stack frames. Stack frames often represent a single function or sub-routine of the program. When a function call is made, a new stack frame is created, and we push the appropriate data onto that frame. The sorts of data include other function calls, saved registers, local variables, the frame pointer of the function being called, and arguments to the function. If you recall going over storage duration, you’ll hopefully remember that automatic variables are stored for the duration of their enclosing scope, which really comes down to the stack frame they belong to. Once the function ends, the stack frame is popped off of the stack, effectively making that memory available once more. Because stack frames are local to the program stack, data can be accessed quickly between frames. The downside to stack frames is that they are volatile, since they are popped off ie. destroyed. This leads us to heap space.</w:t>
       </w:r>
     </w:p>
     <w:p>
@@ -13829,43 +10990,7 @@
           <w:u w:val="none"/>
         </w:rPr>
         <w:tab/>
-        <w:t xml:space="preserve">Stack space is wonderful for storing variables with automatic storage duration, but what about variables with static or external storage duration? These types of variables must live for the duration of the program, so stack space is not appropriate for storing them. The solution that computer scientists came up with was to store these variables outside of the stack in what we call heap space (basically anywhere that isn’t </w:t>
-      </w:r>
-      <w:r>
-        <w:rPr>
-          <w:u w:val="none"/>
-        </w:rPr>
-        <w:t>within</w:t>
-      </w:r>
-      <w:r>
-        <w:rPr>
-          <w:u w:val="none"/>
-        </w:rPr>
-        <w:t xml:space="preserve"> a stack </w:t>
-      </w:r>
-      <w:r>
-        <w:rPr>
-          <w:u w:val="none"/>
-        </w:rPr>
-        <w:t>frame</w:t>
-      </w:r>
-      <w:r>
-        <w:rPr>
-          <w:u w:val="none"/>
-        </w:rPr>
-        <w:t>). Since these variables are not local to the stack, we must keep track of their addresses in order to read/write to/</w:t>
-      </w:r>
-      <w:r>
-        <w:rPr>
-          <w:u w:val="none"/>
-        </w:rPr>
-        <w:t>from</w:t>
-      </w:r>
-      <w:r>
-        <w:rPr>
-          <w:u w:val="none"/>
-        </w:rPr>
-        <w:t xml:space="preserve"> them. This is what pointers are used for. We create a pointer variable which is local to our stack, and that pointer contains the address (often times called a reference) to the object in heap space. Heap space is dangerous because if the pointer variable (which is volatile) is destroyed, then we lose the reference/address to the variable defined in heap space. If we lose this reference, it is impossible to retrieve the variable in heap space, so we call that a data leak. But it gets worse because not only can we have pointers to variables, but also to large regions of memory. Losing the reference to a large block of memory means that that memory will not be deallocated until the program is done executing, and can significantly reduce performance of the system if we’re not careful. </w:t>
+        <w:t xml:space="preserve">Stack space is wonderful for storing variables with automatic storage duration, but what about variables with static or external storage duration? These types of variables must live for the duration of the program, so stack space is not appropriate for storing them. The solution that computer scientists came up with was to store these variables outside of the stack in what we call heap space (basically anywhere that isn’t within a stack frame). Since these variables are not local to the stack, we must keep track of their addresses in order to read/write to/from them. This is what pointers are used for. We create a pointer variable which is local to our stack, and that pointer contains the address (often times called a reference) to the object in heap space. Heap space is dangerous because if the pointer variable (which is volatile) is destroyed, then we lose the reference/address to the variable defined in heap space. If we lose this reference, it is impossible to retrieve the variable in heap space, so we call that a data leak. But it gets worse because not only can we have pointers to variables, but also to large regions of memory. Losing the reference to a large block of memory means that that memory will not be deallocated until the program is done executing, and can significantly reduce performance of the system if we’re not careful. </w:t>
       </w:r>
     </w:p>
     <w:p>
@@ -50570,6 +47695,146 @@
         </w:rPr>
         <w:tab/>
         <w:t>If we are creating a shared library, it is important that our code be position-independent. This means that it does not start at a specific address in RAM, such as 0xAA342BE6F. Similarily, if we need to load an entire executable into RAM, we can do so. Both of these features have the added benefit of Address Space Layout Randomization (ASLR), which makes it more difficult for attackers to locate the starting position of your program or shared object and exploit it. We can use the -f option in gcc followed by PIC (position-independent code) or PIE (position-independent executable) depending on if we’re creating a shared object, or an executable that gets loaded into memory eg. -fPIC or -fPIE.</w:t>
+      </w:r>
+    </w:p>
+    <w:p>
+      <w:pPr>
+        <w:pStyle w:val="ListContents"/>
+        <w:widowControl/>
+        <w:ind w:left="0" w:hanging="0"/>
+        <w:rPr>
+          <w:u w:val="single"/>
+        </w:rPr>
+      </w:pPr>
+      <w:r>
+        <w:rPr/>
+      </w:r>
+    </w:p>
+    <w:p>
+      <w:pPr>
+        <w:pStyle w:val="ListContents"/>
+        <w:widowControl/>
+        <w:ind w:left="0" w:hanging="0"/>
+        <w:rPr>
+          <w:u w:val="single"/>
+        </w:rPr>
+      </w:pPr>
+      <w:r>
+        <w:rPr>
+          <w:u w:val="single"/>
+        </w:rPr>
+        <w:t>Creating a Static Library:</w:t>
+      </w:r>
+    </w:p>
+    <w:p>
+      <w:pPr>
+        <w:pStyle w:val="ListContents"/>
+        <w:widowControl/>
+        <w:ind w:left="0" w:hanging="0"/>
+        <w:rPr>
+          <w:u w:val="single"/>
+        </w:rPr>
+      </w:pPr>
+      <w:r>
+        <w:rPr>
+          <w:u w:val="none"/>
+        </w:rPr>
+        <w:tab/>
+        <w:t xml:space="preserve">Static libraries have rapidly been losing their appeal due to the unfortunate draw-back of making code too large. To illustrate this, imagine that libc was a static library. Let’s also say that libc was 500MB in size. This might be acceptable for one program, but since virtually all C programs link with libc, every process on your computer would be taking up an additional 500MB of space. If you had 500 processes running, then you’d have 250GB taken up by libc!!! None-the-less, there are valid reasons for using static libraries, especially for the ease-of-use, so it’s good to know how to build one. </w:t>
+      </w:r>
+      <w:r>
+        <w:rPr>
+          <w:u w:val="none"/>
+        </w:rPr>
+        <w:t xml:space="preserve">Creating static libraries is unique in that we don’t actually do it using gcc. Instead, we use a command line utility called ar which stands for archive. This makes more sense when you realize that static libraries are really just archives that contain a bunch of object files. Assuming that we have 3 object files, file1.o, file2.o and file3.o, we can create a static library as follows: ar rcs libstatic.a file1.o file2.o file3.o. The usage of the ar command is a bit strange but essentially, rcs is actually 3 separate subcommands. The r stands for replace ie. replace an existing library with the same name if it exists, the c option stands for create ie. create the static library if it doesn’t exist, and s means index (not sure why it’s an s and not i) ie. create an index which tells the compiler that it’s a library file that we’re creating. Note that the library is the first file in the list of all files and then each proceeding file is assumed to be an object file that will be added to the archive. </w:t>
+      </w:r>
+      <w:r>
+        <w:rPr>
+          <w:u w:val="none"/>
+        </w:rPr>
+        <w:t xml:space="preserve">It is important that the name of our library starts with the prefix “lib” because another compiler flag, -l, assumes that all libraries start with that prefix. </w:t>
+      </w:r>
+      <w:r>
+        <w:rPr>
+          <w:u w:val="none"/>
+        </w:rPr>
+        <w:t>In order to link with our static library, we can either add it in the dependency list when compiling with gcc (along with the other object files), or we can link using the -l option in gcc eg. -lstatic means “link with libstatic.a”.</w:t>
+      </w:r>
+    </w:p>
+    <w:p>
+      <w:pPr>
+        <w:pStyle w:val="ListContents"/>
+        <w:widowControl/>
+        <w:ind w:left="0" w:hanging="0"/>
+        <w:rPr>
+          <w:u w:val="none"/>
+        </w:rPr>
+      </w:pPr>
+      <w:r>
+        <w:rPr>
+          <w:u w:val="single"/>
+        </w:rPr>
+      </w:r>
+    </w:p>
+    <w:p>
+      <w:pPr>
+        <w:pStyle w:val="ListContents"/>
+        <w:widowControl/>
+        <w:ind w:left="0" w:hanging="0"/>
+        <w:rPr>
+          <w:u w:val="single"/>
+        </w:rPr>
+      </w:pPr>
+      <w:r>
+        <w:rPr>
+          <w:u w:val="single"/>
+        </w:rPr>
+        <w:t>Creating a Dynamically Linked Library (DLL):</w:t>
+      </w:r>
+    </w:p>
+    <w:p>
+      <w:pPr>
+        <w:pStyle w:val="ListContents"/>
+        <w:widowControl/>
+        <w:ind w:left="0" w:hanging="0"/>
+        <w:rPr>
+          <w:u w:val="single"/>
+        </w:rPr>
+      </w:pPr>
+      <w:r>
+        <w:rPr>
+          <w:u w:val="none"/>
+        </w:rPr>
+        <w:tab/>
+        <w:t xml:space="preserve">As we’ve covered already, DLLs (which are represented as shared object files in Linux) are libraries that are constantly stored in RAM for us to link with during the loader phase of the compilation pipeline. These have many benefits such as keeping our binaries small as well as the fact that they are more easily updated/maintained. In order to create a shared object file, our code must be position independent, since we want to give it flexibility as to where it’s stored in RAM (and because we don’t want to allocate space for it if it is not being used). This is accomplished using the -fPIC option in gcc. Another important flag is the -shared flag which specifies that we are </w:t>
+      </w:r>
+      <w:r>
+        <w:rPr>
+          <w:u w:val="none"/>
+        </w:rPr>
+        <w:t xml:space="preserve">creating a shared object. In order to create the shared object file given 3 source files – file1.c, file2.c, and file3.c, we can simply run gcc -fPIC -shared -o libshared.so file1.c file2.c file3.c. </w:t>
+      </w:r>
+      <w:r>
+        <w:rPr>
+          <w:u w:val="none"/>
+        </w:rPr>
+        <w:t xml:space="preserve">Unlike static libraries, we can’t just link a shared object file by adding it to the dependency list as we would with our object files. We </w:t>
+      </w:r>
+      <w:r>
+        <w:rPr>
+          <w:i/>
+          <w:iCs/>
+          <w:u w:val="none"/>
+        </w:rPr>
+        <w:t>must</w:t>
+      </w:r>
+      <w:r>
+        <w:rPr>
+          <w:i w:val="false"/>
+          <w:iCs w:val="false"/>
+          <w:u w:val="none"/>
+        </w:rPr>
+        <w:t xml:space="preserve"> use the -l flag. In this case, we’d do -lshared to link with libshared.so.</w:t>
       </w:r>
     </w:p>
     <w:p>
@@ -51211,7 +48476,7 @@
     <w:pPr>
       <w:widowControl/>
       <w:suppressAutoHyphens w:val="true"/>
-      <w:overflowPunct w:val="false"/>
+      <w:overflowPunct w:val="true"/>
       <w:bidi w:val="0"/>
       <w:spacing w:lineRule="auto" w:line="259" w:before="0" w:after="160"/>
       <w:jc w:val="left"/>

</xml_diff>